<commit_message>
feat: add cover letter management functionality
- Implemented cover letter form for creating and editing cover letters.
- Added cover letter index view to list all cover letters with actions.
- Created a preview page for cover letters with download options for DOCX and PDF.
- Updated admin dashboard to include cover letter management section.
- Removed unused resume preview page and adjusted resume hub navigation.
- Introduced scripts for generating cover letters in DOCX format from Markdown.
- Added support for Markdown to OOXML conversion for cover letter content.
- Updated Vite configuration to include cover letter styles.
</commit_message>
<xml_diff>
--- a/resources/resume/2026 cover letter template.docx
+++ b/resources/resume/2026 cover letter template.docx
@@ -29,23 +29,7 @@
           <w:sz w:val="24"/>
           <w:szCs w:val="24"/>
         </w:rPr>
-        <w:t>{</w:t>
-      </w:r>
-      <w:proofErr w:type="spellStart"/>
-      <w:r>
-        <w:rPr>
-          <w:sz w:val="24"/>
-          <w:szCs w:val="24"/>
-        </w:rPr>
-        <w:t>companyAddress</w:t>
-      </w:r>
-      <w:proofErr w:type="spellEnd"/>
-      <w:r>
-        <w:rPr>
-          <w:sz w:val="24"/>
-          <w:szCs w:val="24"/>
-        </w:rPr>
-        <w:t>}</w:t>
+        <w:t>{companyAddress}</w:t>
       </w:r>
     </w:p>
     <w:p>
@@ -75,23 +59,7 @@
           <w:sz w:val="24"/>
           <w:szCs w:val="24"/>
         </w:rPr>
-        <w:t>{</w:t>
-      </w:r>
-      <w:proofErr w:type="spellStart"/>
-      <w:r>
-        <w:rPr>
-          <w:sz w:val="24"/>
-          <w:szCs w:val="24"/>
-        </w:rPr>
-        <w:t>messageBody</w:t>
-      </w:r>
-      <w:proofErr w:type="spellEnd"/>
-      <w:r>
-        <w:rPr>
-          <w:sz w:val="24"/>
-          <w:szCs w:val="24"/>
-        </w:rPr>
-        <w:t>}</w:t>
+        <w:t>{@messageBody}</w:t>
       </w:r>
     </w:p>
     <w:p>

</xml_diff>

<commit_message>
feat: enhance cover letter generation with personal info and update templates
</commit_message>
<xml_diff>
--- a/resources/resume/2026 cover letter template.docx
+++ b/resources/resume/2026 cover letter template.docx
@@ -9,6 +9,409 @@
           <w:szCs w:val="24"/>
         </w:rPr>
       </w:pPr>
+      <w:r>
+        <w:rPr>
+          <w:noProof/>
+          <w:sz w:val="24"/>
+          <w:szCs w:val="24"/>
+        </w:rPr>
+        <mc:AlternateContent>
+          <mc:Choice Requires="wps">
+            <w:drawing>
+              <wp:anchor distT="0" distB="0" distL="114300" distR="114300" simplePos="0" relativeHeight="251659264" behindDoc="0" locked="0" layoutInCell="1" allowOverlap="1" wp14:anchorId="2C9BA6AC" wp14:editId="1267B54F">
+                <wp:simplePos x="0" y="0"/>
+                <wp:positionH relativeFrom="page">
+                  <wp:posOffset>0</wp:posOffset>
+                </wp:positionH>
+                <wp:positionV relativeFrom="page">
+                  <wp:posOffset>0</wp:posOffset>
+                </wp:positionV>
+                <wp:extent cx="7763256" cy="914400"/>
+                <wp:effectExtent l="0" t="0" r="28575" b="19050"/>
+                <wp:wrapNone/>
+                <wp:docPr id="402815498" name="Rectangle 2"/>
+                <wp:cNvGraphicFramePr/>
+                <a:graphic xmlns:a="http://schemas.openxmlformats.org/drawingml/2006/main">
+                  <a:graphicData uri="http://schemas.microsoft.com/office/word/2010/wordprocessingShape">
+                    <wps:wsp>
+                      <wps:cNvSpPr/>
+                      <wps:spPr>
+                        <a:xfrm>
+                          <a:off x="0" y="0"/>
+                          <a:ext cx="7763256" cy="914400"/>
+                        </a:xfrm>
+                        <a:prstGeom prst="rect">
+                          <a:avLst/>
+                        </a:prstGeom>
+                        <a:solidFill>
+                          <a:schemeClr val="accent3"/>
+                        </a:solidFill>
+                      </wps:spPr>
+                      <wps:style>
+                        <a:lnRef idx="2">
+                          <a:schemeClr val="accent1">
+                            <a:shade val="15000"/>
+                          </a:schemeClr>
+                        </a:lnRef>
+                        <a:fillRef idx="1">
+                          <a:schemeClr val="accent1"/>
+                        </a:fillRef>
+                        <a:effectRef idx="0">
+                          <a:schemeClr val="accent1"/>
+                        </a:effectRef>
+                        <a:fontRef idx="minor">
+                          <a:schemeClr val="lt1"/>
+                        </a:fontRef>
+                      </wps:style>
+                      <wps:txbx>
+                        <w:txbxContent>
+                          <w:p>
+                            <w:pPr>
+                              <w:pStyle w:val="Title"/>
+                              <w:ind w:left="90"/>
+                              <w:rPr>
+                                <w:b/>
+                                <w:bCs/>
+                                <w:caps/>
+                                <w:color w:val="FFFFFF" w:themeColor="background1"/>
+                                <w:sz w:val="48"/>
+                                <w:szCs w:val="48"/>
+                              </w:rPr>
+                            </w:pPr>
+                            <w:r>
+                              <w:rPr>
+                                <w:b/>
+                                <w:bCs/>
+                                <w:caps/>
+                                <w:color w:val="FFFFFF" w:themeColor="background1"/>
+                                <w:sz w:val="48"/>
+                                <w:szCs w:val="48"/>
+                              </w:rPr>
+                              <w:t>{name}</w:t>
+                            </w:r>
+                          </w:p>
+                          <w:p>
+                            <w:pPr>
+                              <w:pStyle w:val="NoSpacing"/>
+                              <w:tabs>
+                                <w:tab w:val="left" w:pos="3600"/>
+                                <w:tab w:val="left" w:pos="7920"/>
+                              </w:tabs>
+                              <w:ind w:left="90"/>
+                              <w:rPr>
+                                <w:color w:val="FFFFFF" w:themeColor="background1"/>
+                                <w:sz w:val="22"/>
+                              </w:rPr>
+                            </w:pPr>
+                            <w:r>
+                              <w:rPr>
+                                <w:color w:val="FFFFFF" w:themeColor="background1"/>
+                                <w:sz w:val="22"/>
+                              </w:rPr>
+                              <w:t>{title}</w:t>
+                            </w:r>
+                            <w:r>
+                              <w:rPr>
+                                <w:rStyle w:val="SubtleReference"/>
+                                <w:rFonts w:ascii="Corbel" w:hAnsi="Corbel"/>
+                                <w:smallCaps w:val="0"/>
+                                <w:color w:val="FFFFFF" w:themeColor="background1"/>
+                                <w:sz w:val="22"/>
+                              </w:rPr>
+                              <w:tab/>
+                            </w:r>
+                            <w:r>
+                              <w:rPr>
+                                <w:color w:val="FFFFFF" w:themeColor="background1"/>
+                                <w:sz w:val="22"/>
+                              </w:rPr>
+                              <w:t>{phone}</w:t>
+                            </w:r>
+                          </w:p>
+                          <w:p>
+                            <w:pPr>
+                              <w:pStyle w:val="NoSpacing"/>
+                              <w:tabs>
+                                <w:tab w:val="left" w:pos="3600"/>
+                                <w:tab w:val="left" w:pos="7920"/>
+                              </w:tabs>
+                              <w:ind w:left="90"/>
+                              <w:rPr>
+                                <w:rStyle w:val="Hyperlink"/>
+                                <w:color w:val="FFFFFF" w:themeColor="background1"/>
+                                <w:sz w:val="22"/>
+                              </w:rPr>
+                            </w:pPr>
+                            <w:r>
+                              <w:rPr>
+                                <w:rStyle w:val="SubtleReference"/>
+                                <w:rFonts w:ascii="Corbel" w:hAnsi="Corbel"/>
+                                <w:smallCaps w:val="0"/>
+                                <w:color w:val="FFFFFF" w:themeColor="background1"/>
+                                <w:sz w:val="22"/>
+                              </w:rPr>
+                              <w:t>{email}</w:t>
+                            </w:r>
+                            <w:r>
+                              <w:rPr>
+                                <w:rStyle w:val="SubtleReference"/>
+                                <w:rFonts w:ascii="Corbel" w:hAnsi="Corbel"/>
+                                <w:smallCaps w:val="0"/>
+                                <w:color w:val="FFFFFF" w:themeColor="background1"/>
+                                <w:sz w:val="22"/>
+                              </w:rPr>
+                              <w:tab/>
+                            </w:r>
+                            <w:r>
+                              <w:rPr>
+                                <w:color w:val="FFFFFF" w:themeColor="background1"/>
+                                <w:sz w:val="22"/>
+                              </w:rPr>
+                              <w:fldChar w:fldCharType="begin"/>
+                            </w:r>
+                            <w:r>
+                              <w:rPr>
+                                <w:color w:val="FFFFFF" w:themeColor="background1"/>
+                                <w:sz w:val="22"/>
+                              </w:rPr>
+                              <w:instrText>HYPERLINK "https://linkedin.com/in/jasonvertucio"</w:instrText>
+                            </w:r>
+                            <w:r>
+                              <w:rPr>
+                                <w:color w:val="FFFFFF" w:themeColor="background1"/>
+                                <w:sz w:val="22"/>
+                              </w:rPr>
+                            </w:r>
+                            <w:r>
+                              <w:rPr>
+                                <w:color w:val="FFFFFF" w:themeColor="background1"/>
+                                <w:sz w:val="22"/>
+                              </w:rPr>
+                              <w:fldChar w:fldCharType="separate"/>
+                            </w:r>
+                            <w:r>
+                              <w:rPr>
+                                <w:rStyle w:val="Hyperlink"/>
+                                <w:color w:val="FFFFFF" w:themeColor="background1"/>
+                                <w:sz w:val="22"/>
+                                <w:u w:val="none"/>
+                              </w:rPr>
+                              <w:t>linkedin.com/in/</w:t>
+                            </w:r>
+                            <w:proofErr w:type="spellStart"/>
+                            <w:r>
+                              <w:rPr>
+                                <w:rStyle w:val="Hyperlink"/>
+                                <w:color w:val="FFFFFF" w:themeColor="background1"/>
+                                <w:sz w:val="22"/>
+                                <w:u w:val="none"/>
+                              </w:rPr>
+                              <w:t>jasonvertucio</w:t>
+                            </w:r>
+                            <w:proofErr w:type="spellEnd"/>
+                          </w:p>
+                          <w:p>
+                            <w:pPr>
+                              <w:jc w:val="center"/>
+                            </w:pPr>
+                            <w:r>
+                              <w:rPr>
+                                <w:color w:val="FFFFFF" w:themeColor="background1"/>
+                                <w:sz w:val="22"/>
+                              </w:rPr>
+                              <w:fldChar w:fldCharType="end"/>
+                            </w:r>
+                          </w:p>
+                        </w:txbxContent>
+                      </wps:txbx>
+                      <wps:bodyPr rot="0" spcFirstLastPara="0" vertOverflow="overflow" horzOverflow="overflow" vert="horz" wrap="square" lIns="91440" tIns="45720" rIns="91440" bIns="45720" numCol="1" spcCol="0" rtlCol="0" fromWordArt="0" anchor="ctr" anchorCtr="0" forceAA="0" compatLnSpc="1">
+                        <a:prstTxWarp prst="textNoShape">
+                          <a:avLst/>
+                        </a:prstTxWarp>
+                        <a:noAutofit/>
+                      </wps:bodyPr>
+                    </wps:wsp>
+                  </a:graphicData>
+                </a:graphic>
+                <wp14:sizeRelH relativeFrom="margin">
+                  <wp14:pctWidth>0</wp14:pctWidth>
+                </wp14:sizeRelH>
+                <wp14:sizeRelV relativeFrom="margin">
+                  <wp14:pctHeight>0</wp14:pctHeight>
+                </wp14:sizeRelV>
+              </wp:anchor>
+            </w:drawing>
+          </mc:Choice>
+          <mc:Fallback>
+            <w:pict>
+              <v:rect w14:anchorId="2C9BA6AC" id="Rectangle 2" o:spid="_x0000_s1026" style="position:absolute;margin-left:0;margin-top:0;width:611.3pt;height:1in;z-index:251659264;visibility:visible;mso-wrap-style:square;mso-width-percent:0;mso-height-percent:0;mso-wrap-distance-left:9pt;mso-wrap-distance-top:0;mso-wrap-distance-right:9pt;mso-wrap-distance-bottom:0;mso-position-horizontal:absolute;mso-position-horizontal-relative:page;mso-position-vertical:absolute;mso-position-vertical-relative:page;mso-width-percent:0;mso-height-percent:0;mso-width-relative:margin;mso-height-relative:margin;v-text-anchor:middle" o:gfxdata="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" fillcolor="#1b587c [3206]" strokecolor="#231201 [484]" strokeweight="1pt">
+                <v:textbox>
+                  <w:txbxContent>
+                    <w:p>
+                      <w:pPr>
+                        <w:pStyle w:val="Title"/>
+                        <w:ind w:left="90"/>
+                        <w:rPr>
+                          <w:b/>
+                          <w:bCs/>
+                          <w:caps/>
+                          <w:color w:val="FFFFFF" w:themeColor="background1"/>
+                          <w:sz w:val="48"/>
+                          <w:szCs w:val="48"/>
+                        </w:rPr>
+                      </w:pPr>
+                      <w:r>
+                        <w:rPr>
+                          <w:b/>
+                          <w:bCs/>
+                          <w:caps/>
+                          <w:color w:val="FFFFFF" w:themeColor="background1"/>
+                          <w:sz w:val="48"/>
+                          <w:szCs w:val="48"/>
+                        </w:rPr>
+                        <w:t>{name}</w:t>
+                      </w:r>
+                    </w:p>
+                    <w:p>
+                      <w:pPr>
+                        <w:pStyle w:val="NoSpacing"/>
+                        <w:tabs>
+                          <w:tab w:val="left" w:pos="3600"/>
+                          <w:tab w:val="left" w:pos="7920"/>
+                        </w:tabs>
+                        <w:ind w:left="90"/>
+                        <w:rPr>
+                          <w:color w:val="FFFFFF" w:themeColor="background1"/>
+                          <w:sz w:val="22"/>
+                        </w:rPr>
+                      </w:pPr>
+                      <w:r>
+                        <w:rPr>
+                          <w:color w:val="FFFFFF" w:themeColor="background1"/>
+                          <w:sz w:val="22"/>
+                        </w:rPr>
+                        <w:t>{title}</w:t>
+                      </w:r>
+                      <w:r>
+                        <w:rPr>
+                          <w:rStyle w:val="SubtleReference"/>
+                          <w:rFonts w:ascii="Corbel" w:hAnsi="Corbel"/>
+                          <w:smallCaps w:val="0"/>
+                          <w:color w:val="FFFFFF" w:themeColor="background1"/>
+                          <w:sz w:val="22"/>
+                        </w:rPr>
+                        <w:tab/>
+                      </w:r>
+                      <w:r>
+                        <w:rPr>
+                          <w:color w:val="FFFFFF" w:themeColor="background1"/>
+                          <w:sz w:val="22"/>
+                        </w:rPr>
+                        <w:t>{phone}</w:t>
+                      </w:r>
+                    </w:p>
+                    <w:p>
+                      <w:pPr>
+                        <w:pStyle w:val="NoSpacing"/>
+                        <w:tabs>
+                          <w:tab w:val="left" w:pos="3600"/>
+                          <w:tab w:val="left" w:pos="7920"/>
+                        </w:tabs>
+                        <w:ind w:left="90"/>
+                        <w:rPr>
+                          <w:rStyle w:val="Hyperlink"/>
+                          <w:color w:val="FFFFFF" w:themeColor="background1"/>
+                          <w:sz w:val="22"/>
+                        </w:rPr>
+                      </w:pPr>
+                      <w:r>
+                        <w:rPr>
+                          <w:rStyle w:val="SubtleReference"/>
+                          <w:rFonts w:ascii="Corbel" w:hAnsi="Corbel"/>
+                          <w:smallCaps w:val="0"/>
+                          <w:color w:val="FFFFFF" w:themeColor="background1"/>
+                          <w:sz w:val="22"/>
+                        </w:rPr>
+                        <w:t>{email}</w:t>
+                      </w:r>
+                      <w:r>
+                        <w:rPr>
+                          <w:rStyle w:val="SubtleReference"/>
+                          <w:rFonts w:ascii="Corbel" w:hAnsi="Corbel"/>
+                          <w:smallCaps w:val="0"/>
+                          <w:color w:val="FFFFFF" w:themeColor="background1"/>
+                          <w:sz w:val="22"/>
+                        </w:rPr>
+                        <w:tab/>
+                      </w:r>
+                      <w:r>
+                        <w:rPr>
+                          <w:color w:val="FFFFFF" w:themeColor="background1"/>
+                          <w:sz w:val="22"/>
+                        </w:rPr>
+                        <w:fldChar w:fldCharType="begin"/>
+                      </w:r>
+                      <w:r>
+                        <w:rPr>
+                          <w:color w:val="FFFFFF" w:themeColor="background1"/>
+                          <w:sz w:val="22"/>
+                        </w:rPr>
+                        <w:instrText>HYPERLINK "https://linkedin.com/in/jasonvertucio"</w:instrText>
+                      </w:r>
+                      <w:r>
+                        <w:rPr>
+                          <w:color w:val="FFFFFF" w:themeColor="background1"/>
+                          <w:sz w:val="22"/>
+                        </w:rPr>
+                      </w:r>
+                      <w:r>
+                        <w:rPr>
+                          <w:color w:val="FFFFFF" w:themeColor="background1"/>
+                          <w:sz w:val="22"/>
+                        </w:rPr>
+                        <w:fldChar w:fldCharType="separate"/>
+                      </w:r>
+                      <w:r>
+                        <w:rPr>
+                          <w:rStyle w:val="Hyperlink"/>
+                          <w:color w:val="FFFFFF" w:themeColor="background1"/>
+                          <w:sz w:val="22"/>
+                          <w:u w:val="none"/>
+                        </w:rPr>
+                        <w:t>linkedin.com/in/</w:t>
+                      </w:r>
+                      <w:proofErr w:type="spellStart"/>
+                      <w:r>
+                        <w:rPr>
+                          <w:rStyle w:val="Hyperlink"/>
+                          <w:color w:val="FFFFFF" w:themeColor="background1"/>
+                          <w:sz w:val="22"/>
+                          <w:u w:val="none"/>
+                        </w:rPr>
+                        <w:t>jasonvertucio</w:t>
+                      </w:r>
+                      <w:proofErr w:type="spellEnd"/>
+                    </w:p>
+                    <w:p>
+                      <w:pPr>
+                        <w:jc w:val="center"/>
+                      </w:pPr>
+                      <w:r>
+                        <w:rPr>
+                          <w:color w:val="FFFFFF" w:themeColor="background1"/>
+                          <w:sz w:val="22"/>
+                        </w:rPr>
+                        <w:fldChar w:fldCharType="end"/>
+                      </w:r>
+                    </w:p>
+                  </w:txbxContent>
+                </v:textbox>
+                <w10:wrap anchorx="page" anchory="page"/>
+              </v:rect>
+            </w:pict>
+          </mc:Fallback>
+        </mc:AlternateContent>
+      </w:r>
       <w:r>
         <w:rPr>
           <w:sz w:val="24"/>
@@ -29,8 +432,32 @@
           <w:sz w:val="24"/>
           <w:szCs w:val="24"/>
         </w:rPr>
-        <w:t>{companyAddress}</w:t>
+        <w:t>{</w:t>
       </w:r>
+      <w:proofErr w:type="spellStart"/>
+      <w:r>
+        <w:rPr>
+          <w:sz w:val="24"/>
+          <w:szCs w:val="24"/>
+        </w:rPr>
+        <w:t>companyAddress</w:t>
+      </w:r>
+      <w:proofErr w:type="spellEnd"/>
+      <w:r>
+        <w:rPr>
+          <w:sz w:val="24"/>
+          <w:szCs w:val="24"/>
+        </w:rPr>
+        <w:t>}</w:t>
+      </w:r>
+    </w:p>
+    <w:p>
+      <w:pPr>
+        <w:rPr>
+          <w:sz w:val="24"/>
+          <w:szCs w:val="24"/>
+        </w:rPr>
+      </w:pPr>
     </w:p>
     <w:p>
       <w:pPr>
@@ -69,14 +496,6 @@
           <w:szCs w:val="24"/>
         </w:rPr>
       </w:pPr>
-    </w:p>
-    <w:p>
-      <w:pPr>
-        <w:rPr>
-          <w:sz w:val="24"/>
-          <w:szCs w:val="24"/>
-        </w:rPr>
-      </w:pPr>
       <w:r>
         <w:rPr>
           <w:sz w:val="24"/>
@@ -87,14 +506,79 @@
     </w:p>
     <w:p>
       <w:pPr>
+        <w:spacing w:after="0"/>
         <w:rPr>
           <w:sz w:val="24"/>
           <w:szCs w:val="24"/>
         </w:rPr>
       </w:pPr>
+      <w:r>
+        <w:rPr>
+          <w:noProof/>
+        </w:rPr>
+        <w:drawing>
+          <wp:inline distT="0" distB="0" distL="0" distR="0" wp14:anchorId="7CBDC097" wp14:editId="7206D14C">
+            <wp:extent cx="828675" cy="1725075"/>
+            <wp:effectExtent l="0" t="0" r="0" b="8890"/>
+            <wp:docPr id="930496902" name="Picture 2"/>
+            <wp:cNvGraphicFramePr>
+              <a:graphicFrameLocks xmlns:a="http://schemas.openxmlformats.org/drawingml/2006/main" noChangeAspect="1"/>
+            </wp:cNvGraphicFramePr>
+            <a:graphic xmlns:a="http://schemas.openxmlformats.org/drawingml/2006/main">
+              <a:graphicData uri="http://schemas.openxmlformats.org/drawingml/2006/picture">
+                <pic:pic xmlns:pic="http://schemas.openxmlformats.org/drawingml/2006/picture">
+                  <pic:nvPicPr>
+                    <pic:cNvPr id="0" name="Picture 1"/>
+                    <pic:cNvPicPr>
+                      <a:picLocks noChangeAspect="1" noChangeArrowheads="1"/>
+                    </pic:cNvPicPr>
+                  </pic:nvPicPr>
+                  <pic:blipFill>
+                    <a:blip r:embed="rId6" cstate="print">
+                      <a:alphaModFix/>
+                      <a:extLst>
+                        <a:ext uri="{BEBA8EAE-BF5A-486C-A8C5-ECC9F3942E4B}">
+                          <a14:imgProps xmlns:a14="http://schemas.microsoft.com/office/drawing/2010/main">
+                            <a14:imgLayer r:embed="rId7">
+                              <a14:imgEffect>
+                                <a14:brightnessContrast bright="-25000" contrast="100000"/>
+                              </a14:imgEffect>
+                            </a14:imgLayer>
+                          </a14:imgProps>
+                        </a:ext>
+                        <a:ext uri="{28A0092B-C50C-407E-A947-70E740481C1C}">
+                          <a14:useLocalDpi xmlns:a14="http://schemas.microsoft.com/office/drawing/2010/main" val="0"/>
+                        </a:ext>
+                      </a:extLst>
+                    </a:blip>
+                    <a:srcRect/>
+                    <a:stretch>
+                      <a:fillRect/>
+                    </a:stretch>
+                  </pic:blipFill>
+                  <pic:spPr bwMode="auto">
+                    <a:xfrm>
+                      <a:off x="0" y="0"/>
+                      <a:ext cx="838680" cy="1745903"/>
+                    </a:xfrm>
+                    <a:prstGeom prst="rect">
+                      <a:avLst/>
+                    </a:prstGeom>
+                    <a:noFill/>
+                    <a:ln>
+                      <a:noFill/>
+                    </a:ln>
+                  </pic:spPr>
+                </pic:pic>
+              </a:graphicData>
+            </a:graphic>
+          </wp:inline>
+        </w:drawing>
+      </w:r>
     </w:p>
     <w:p>
       <w:pPr>
+        <w:spacing w:line="240" w:lineRule="auto"/>
         <w:rPr>
           <w:sz w:val="24"/>
           <w:szCs w:val="24"/>
@@ -109,7 +593,7 @@
       </w:r>
     </w:p>
     <w:sectPr>
-      <w:headerReference w:type="default" r:id="rId6"/>
+      <w:type w:val="continuous"/>
       <w:pgSz w:w="12240" w:h="15840"/>
       <w:pgMar w:top="1620" w:right="720" w:bottom="720" w:left="720" w:header="90" w:footer="720" w:gutter="0"/>
       <w:cols w:space="720"/>
@@ -167,399 +651,6 @@
     </w:p>
   </w:footnote>
 </w:footnotes>
-</file>
-
-<file path=word/header1.xml><?xml version="1.0" encoding="utf-8"?>
-<w:hdr xmlns:wpc="http://schemas.microsoft.com/office/word/2010/wordprocessingCanvas" xmlns:cx="http://schemas.microsoft.com/office/drawing/2014/chartex" xmlns:cx1="http://schemas.microsoft.com/office/drawing/2015/9/8/chartex" xmlns:cx2="http://schemas.microsoft.com/office/drawing/2015/10/21/chartex" xmlns:cx3="http://schemas.microsoft.com/office/drawing/2016/5/9/chartex" xmlns:cx4="http://schemas.microsoft.com/office/drawing/2016/5/10/chartex" xmlns:cx5="http://schemas.microsoft.com/office/drawing/2016/5/11/chartex" xmlns:cx6="http://schemas.microsoft.com/office/drawing/2016/5/12/chartex" xmlns:cx7="http://schemas.microsoft.com/office/drawing/2016/5/13/chartex" xmlns:cx8="http://schemas.microsoft.com/office/drawing/2016/5/14/chartex" xmlns:mc="http://schemas.openxmlformats.org/markup-compatibility/2006" xmlns:aink="http://schemas.microsoft.com/office/drawing/2016/ink" xmlns:am3d="http://schemas.microsoft.com/office/drawing/2017/model3d" xmlns:o="urn:schemas-microsoft-com:office:office" xmlns:oel="http://schemas.microsoft.com/office/2019/extlst" xmlns:r="http://schemas.openxmlformats.org/officeDocument/2006/relationships" xmlns:m="http://schemas.openxmlformats.org/officeDocument/2006/math" xmlns:v="urn:schemas-microsoft-com:vml" xmlns:wp14="http://schemas.microsoft.com/office/word/2010/wordprocessingDrawing" xmlns:wp="http://schemas.openxmlformats.org/drawingml/2006/wordprocessingDrawing" xmlns:w10="urn:schemas-microsoft-com:office:word" xmlns:w="http://schemas.openxmlformats.org/wordprocessingml/2006/main" xmlns:w14="http://schemas.microsoft.com/office/word/2010/wordml" xmlns:w15="http://schemas.microsoft.com/office/word/2012/wordml" xmlns:w16cex="http://schemas.microsoft.com/office/word/2018/wordml/cex" xmlns:w16cid="http://schemas.microsoft.com/office/word/2016/wordml/cid" xmlns:w16="http://schemas.microsoft.com/office/word/2018/wordml" xmlns:w16du="http://schemas.microsoft.com/office/word/2023/wordml/word16du" xmlns:w16sdtdh="http://schemas.microsoft.com/office/word/2020/wordml/sdtdatahash" xmlns:w16sdtfl="http://schemas.microsoft.com/office/word/2024/wordml/sdtformatlock" xmlns:w16se="http://schemas.microsoft.com/office/word/2015/wordml/symex" xmlns:wpg="http://schemas.microsoft.com/office/word/2010/wordprocessingGroup" xmlns:wpi="http://schemas.microsoft.com/office/word/2010/wordprocessingInk" xmlns:wne="http://schemas.microsoft.com/office/word/2006/wordml" xmlns:wps="http://schemas.microsoft.com/office/word/2010/wordprocessingShape" mc:Ignorable="w14 w15 w16se w16cid w16 w16cex w16sdtdh w16sdtfl w16du wp14">
-  <w:p>
-    <w:pPr>
-      <w:pStyle w:val="Header"/>
-      <w:tabs>
-        <w:tab w:val="left" w:pos="3600"/>
-        <w:tab w:val="left" w:pos="7920"/>
-      </w:tabs>
-    </w:pPr>
-    <w:r>
-      <w:rPr>
-        <w:noProof/>
-      </w:rPr>
-      <mc:AlternateContent>
-        <mc:Choice Requires="wps">
-          <w:drawing>
-            <wp:anchor distT="0" distB="0" distL="114300" distR="114300" simplePos="0" relativeHeight="251659264" behindDoc="1" locked="0" layoutInCell="1" allowOverlap="0" wp14:anchorId="09AB09E3" wp14:editId="6090E7AA">
-              <wp:simplePos x="0" y="0"/>
-              <wp:positionH relativeFrom="page">
-                <wp:posOffset>7814</wp:posOffset>
-              </wp:positionH>
-              <wp:positionV relativeFrom="page">
-                <wp:posOffset>-15631</wp:posOffset>
-              </wp:positionV>
-              <wp:extent cx="7885723" cy="1033272"/>
-              <wp:effectExtent l="0" t="0" r="1270" b="0"/>
-              <wp:wrapTight wrapText="bothSides">
-                <wp:wrapPolygon edited="0">
-                  <wp:start x="0" y="0"/>
-                  <wp:lineTo x="0" y="21109"/>
-                  <wp:lineTo x="21551" y="21109"/>
-                  <wp:lineTo x="21551" y="0"/>
-                  <wp:lineTo x="0" y="0"/>
-                </wp:wrapPolygon>
-              </wp:wrapTight>
-              <wp:docPr id="1156361867" name="Text Box 1"/>
-              <wp:cNvGraphicFramePr/>
-              <a:graphic xmlns:a="http://schemas.openxmlformats.org/drawingml/2006/main">
-                <a:graphicData uri="http://schemas.microsoft.com/office/word/2010/wordprocessingShape">
-                  <wps:wsp>
-                    <wps:cNvSpPr txBox="1"/>
-                    <wps:spPr>
-                      <a:xfrm>
-                        <a:off x="0" y="0"/>
-                        <a:ext cx="7885723" cy="1033272"/>
-                      </a:xfrm>
-                      <a:prstGeom prst="rect">
-                        <a:avLst/>
-                      </a:prstGeom>
-                      <a:ln>
-                        <a:noFill/>
-                      </a:ln>
-                    </wps:spPr>
-                    <wps:style>
-                      <a:lnRef idx="3">
-                        <a:schemeClr val="lt1"/>
-                      </a:lnRef>
-                      <a:fillRef idx="1">
-                        <a:schemeClr val="accent3"/>
-                      </a:fillRef>
-                      <a:effectRef idx="1">
-                        <a:schemeClr val="accent3"/>
-                      </a:effectRef>
-                      <a:fontRef idx="minor">
-                        <a:schemeClr val="lt1"/>
-                      </a:fontRef>
-                    </wps:style>
-                    <wps:txbx>
-                      <w:txbxContent>
-                        <w:p>
-                          <w:pPr>
-                            <w:pStyle w:val="Title"/>
-                            <w:ind w:left="90"/>
-                            <w:rPr>
-                              <w:b/>
-                              <w:bCs/>
-                            </w:rPr>
-                          </w:pPr>
-                          <w:r>
-                            <w:rPr>
-                              <w:b/>
-                              <w:bCs/>
-                            </w:rPr>
-                            <w:t>JASON VERTUCIO</w:t>
-                          </w:r>
-                        </w:p>
-                        <w:p>
-                          <w:pPr>
-                            <w:pStyle w:val="NoSpacing"/>
-                            <w:tabs>
-                              <w:tab w:val="left" w:pos="3600"/>
-                              <w:tab w:val="left" w:pos="7920"/>
-                            </w:tabs>
-                            <w:ind w:left="90"/>
-                            <w:rPr>
-                              <w:b/>
-                              <w:bCs/>
-                            </w:rPr>
-                          </w:pPr>
-                          <w:r>
-                            <w:rPr>
-                              <w:b/>
-                              <w:bCs/>
-                            </w:rPr>
-                            <w:t>Senior-</w:t>
-                          </w:r>
-                          <w:r>
-                            <w:rPr>
-                              <w:b/>
-                              <w:bCs/>
-                            </w:rPr>
-                            <w:t>Front-End Engineer</w:t>
-                          </w:r>
-                          <w:r>
-                            <w:rPr>
-                              <w:rStyle w:val="SubtleReference"/>
-                              <w:rFonts w:ascii="Tw Cen MT" w:hAnsi="Tw Cen MT"/>
-                              <w:b/>
-                              <w:bCs/>
-                              <w:smallCaps w:val="0"/>
-                              <w:color w:val="auto"/>
-                            </w:rPr>
-                            <w:tab/>
-                          </w:r>
-                          <w:r>
-                            <w:rPr>
-                              <w:b/>
-                              <w:bCs/>
-                            </w:rPr>
-                            <w:t>TypeScript + JavaScript + Vue</w:t>
-                          </w:r>
-                          <w:r>
-                            <w:rPr>
-                              <w:rStyle w:val="SubtleReference"/>
-                              <w:rFonts w:ascii="Tw Cen MT" w:hAnsi="Tw Cen MT"/>
-                              <w:b/>
-                              <w:bCs/>
-                              <w:smallCaps w:val="0"/>
-                              <w:color w:val="auto"/>
-                            </w:rPr>
-                            <w:tab/>
-                          </w:r>
-                          <w:r>
-                            <w:rPr>
-                              <w:b/>
-                              <w:bCs/>
-                            </w:rPr>
-                            <w:t>PHP + Laravel</w:t>
-                          </w:r>
-                        </w:p>
-                        <w:p>
-                          <w:pPr>
-                            <w:pStyle w:val="NoSpacing"/>
-                            <w:tabs>
-                              <w:tab w:val="left" w:pos="3600"/>
-                              <w:tab w:val="left" w:pos="7920"/>
-                            </w:tabs>
-                            <w:ind w:left="90"/>
-                          </w:pPr>
-                          <w:r>
-                            <w:rPr>
-                              <w:rStyle w:val="SubtleReference"/>
-                              <w:rFonts w:ascii="Tw Cen MT" w:hAnsi="Tw Cen MT"/>
-                              <w:smallCaps w:val="0"/>
-                              <w:color w:val="auto"/>
-                            </w:rPr>
-                            <w:t>m.jasonvertucio@gmail.com</w:t>
-                          </w:r>
-                          <w:r>
-                            <w:rPr>
-                              <w:rStyle w:val="SubtleReference"/>
-                              <w:rFonts w:ascii="Tw Cen MT" w:hAnsi="Tw Cen MT"/>
-                              <w:smallCaps w:val="0"/>
-                              <w:color w:val="auto"/>
-                            </w:rPr>
-                            <w:tab/>
-                          </w:r>
-                          <w:r>
-                            <w:t>(267) 323-5171</w:t>
-                          </w:r>
-                          <w:r>
-                            <w:rPr>
-                              <w:rStyle w:val="SubtleReference"/>
-                              <w:rFonts w:ascii="Tw Cen MT" w:hAnsi="Tw Cen MT"/>
-                              <w:smallCaps w:val="0"/>
-                              <w:color w:val="auto"/>
-                            </w:rPr>
-                            <w:tab/>
-                          </w:r>
-                          <w:hyperlink r:id="rId1" w:history="1">
-                            <w:r>
-                              <w:rPr>
-                                <w:rStyle w:val="Hyperlink"/>
-                                <w:color w:val="FFFFFF" w:themeColor="background1"/>
-                                <w:u w:val="none"/>
-                              </w:rPr>
-                              <w:t>linkedin.com/in/</w:t>
-                            </w:r>
-                            <w:proofErr w:type="spellStart"/>
-                            <w:r>
-                              <w:rPr>
-                                <w:rStyle w:val="Hyperlink"/>
-                                <w:color w:val="FFFFFF" w:themeColor="background1"/>
-                                <w:u w:val="none"/>
-                              </w:rPr>
-                              <w:t>jasonvertucio</w:t>
-                            </w:r>
-                            <w:proofErr w:type="spellEnd"/>
-                          </w:hyperlink>
-                        </w:p>
-                      </w:txbxContent>
-                    </wps:txbx>
-                    <wps:bodyPr rot="0" spcFirstLastPara="0" vertOverflow="overflow" horzOverflow="overflow" vert="horz" wrap="square" lIns="91440" tIns="45720" rIns="91440" bIns="45720" numCol="1" spcCol="0" rtlCol="0" fromWordArt="0" anchor="t" anchorCtr="0" forceAA="0" compatLnSpc="1">
-                      <a:prstTxWarp prst="textNoShape">
-                        <a:avLst/>
-                      </a:prstTxWarp>
-                      <a:noAutofit/>
-                    </wps:bodyPr>
-                  </wps:wsp>
-                </a:graphicData>
-              </a:graphic>
-              <wp14:sizeRelH relativeFrom="margin">
-                <wp14:pctWidth>0</wp14:pctWidth>
-              </wp14:sizeRelH>
-              <wp14:sizeRelV relativeFrom="margin">
-                <wp14:pctHeight>0</wp14:pctHeight>
-              </wp14:sizeRelV>
-            </wp:anchor>
-          </w:drawing>
-        </mc:Choice>
-        <mc:Fallback>
-          <w:pict>
-            <v:shapetype w14:anchorId="09AB09E3" id="_x0000_t202" coordsize="21600,21600" o:spt="202" path="m,l,21600r21600,l21600,xe">
-              <v:stroke joinstyle="miter"/>
-              <v:path gradientshapeok="t" o:connecttype="rect"/>
-            </v:shapetype>
-            <v:shape id="Text Box 1" o:spid="_x0000_s1026" type="#_x0000_t202" style="position:absolute;margin-left:.6pt;margin-top:-1.25pt;width:620.9pt;height:81.35pt;z-index:-251657216;visibility:visible;mso-wrap-style:square;mso-width-percent:0;mso-height-percent:0;mso-wrap-distance-left:9pt;mso-wrap-distance-top:0;mso-wrap-distance-right:9pt;mso-wrap-distance-bottom:0;mso-position-horizontal:absolute;mso-position-horizontal-relative:page;mso-position-vertical:absolute;mso-position-vertical-relative:page;mso-width-percent:0;mso-height-percent:0;mso-width-relative:margin;mso-height-relative:margin;v-text-anchor:top" o:gfxdata="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" o:allowoverlap="f" fillcolor="#1b587c [3206]" stroked="f" strokeweight="1.5pt">
-              <v:textbox>
-                <w:txbxContent>
-                  <w:p>
-                    <w:pPr>
-                      <w:pStyle w:val="Title"/>
-                      <w:ind w:left="90"/>
-                      <w:rPr>
-                        <w:b/>
-                        <w:bCs/>
-                      </w:rPr>
-                    </w:pPr>
-                    <w:r>
-                      <w:rPr>
-                        <w:b/>
-                        <w:bCs/>
-                      </w:rPr>
-                      <w:t>JASON VERTUCIO</w:t>
-                    </w:r>
-                  </w:p>
-                  <w:p>
-                    <w:pPr>
-                      <w:pStyle w:val="NoSpacing"/>
-                      <w:tabs>
-                        <w:tab w:val="left" w:pos="3600"/>
-                        <w:tab w:val="left" w:pos="7920"/>
-                      </w:tabs>
-                      <w:ind w:left="90"/>
-                      <w:rPr>
-                        <w:b/>
-                        <w:bCs/>
-                      </w:rPr>
-                    </w:pPr>
-                    <w:r>
-                      <w:rPr>
-                        <w:b/>
-                        <w:bCs/>
-                      </w:rPr>
-                      <w:t>Senior-</w:t>
-                    </w:r>
-                    <w:r>
-                      <w:rPr>
-                        <w:b/>
-                        <w:bCs/>
-                      </w:rPr>
-                      <w:t>Front-End Engineer</w:t>
-                    </w:r>
-                    <w:r>
-                      <w:rPr>
-                        <w:rStyle w:val="SubtleReference"/>
-                        <w:rFonts w:ascii="Tw Cen MT" w:hAnsi="Tw Cen MT"/>
-                        <w:b/>
-                        <w:bCs/>
-                        <w:smallCaps w:val="0"/>
-                        <w:color w:val="auto"/>
-                      </w:rPr>
-                      <w:tab/>
-                    </w:r>
-                    <w:r>
-                      <w:rPr>
-                        <w:b/>
-                        <w:bCs/>
-                      </w:rPr>
-                      <w:t>TypeScript + JavaScript + Vue</w:t>
-                    </w:r>
-                    <w:r>
-                      <w:rPr>
-                        <w:rStyle w:val="SubtleReference"/>
-                        <w:rFonts w:ascii="Tw Cen MT" w:hAnsi="Tw Cen MT"/>
-                        <w:b/>
-                        <w:bCs/>
-                        <w:smallCaps w:val="0"/>
-                        <w:color w:val="auto"/>
-                      </w:rPr>
-                      <w:tab/>
-                    </w:r>
-                    <w:r>
-                      <w:rPr>
-                        <w:b/>
-                        <w:bCs/>
-                      </w:rPr>
-                      <w:t>PHP + Laravel</w:t>
-                    </w:r>
-                  </w:p>
-                  <w:p>
-                    <w:pPr>
-                      <w:pStyle w:val="NoSpacing"/>
-                      <w:tabs>
-                        <w:tab w:val="left" w:pos="3600"/>
-                        <w:tab w:val="left" w:pos="7920"/>
-                      </w:tabs>
-                      <w:ind w:left="90"/>
-                    </w:pPr>
-                    <w:r>
-                      <w:rPr>
-                        <w:rStyle w:val="SubtleReference"/>
-                        <w:rFonts w:ascii="Tw Cen MT" w:hAnsi="Tw Cen MT"/>
-                        <w:smallCaps w:val="0"/>
-                        <w:color w:val="auto"/>
-                      </w:rPr>
-                      <w:t>m.jasonvertucio@gmail.com</w:t>
-                    </w:r>
-                    <w:r>
-                      <w:rPr>
-                        <w:rStyle w:val="SubtleReference"/>
-                        <w:rFonts w:ascii="Tw Cen MT" w:hAnsi="Tw Cen MT"/>
-                        <w:smallCaps w:val="0"/>
-                        <w:color w:val="auto"/>
-                      </w:rPr>
-                      <w:tab/>
-                    </w:r>
-                    <w:r>
-                      <w:t>(267) 323-5171</w:t>
-                    </w:r>
-                    <w:r>
-                      <w:rPr>
-                        <w:rStyle w:val="SubtleReference"/>
-                        <w:rFonts w:ascii="Tw Cen MT" w:hAnsi="Tw Cen MT"/>
-                        <w:smallCaps w:val="0"/>
-                        <w:color w:val="auto"/>
-                      </w:rPr>
-                      <w:tab/>
-                    </w:r>
-                    <w:hyperlink r:id="rId2" w:history="1">
-                      <w:r>
-                        <w:rPr>
-                          <w:rStyle w:val="Hyperlink"/>
-                          <w:color w:val="FFFFFF" w:themeColor="background1"/>
-                          <w:u w:val="none"/>
-                        </w:rPr>
-                        <w:t>linkedin.com/in/</w:t>
-                      </w:r>
-                      <w:proofErr w:type="spellStart"/>
-                      <w:r>
-                        <w:rPr>
-                          <w:rStyle w:val="Hyperlink"/>
-                          <w:color w:val="FFFFFF" w:themeColor="background1"/>
-                          <w:u w:val="none"/>
-                        </w:rPr>
-                        <w:t>jasonvertucio</w:t>
-                      </w:r>
-                      <w:proofErr w:type="spellEnd"/>
-                    </w:hyperlink>
-                  </w:p>
-                </w:txbxContent>
-              </v:textbox>
-              <w10:wrap type="tight" anchorx="page" anchory="page"/>
-            </v:shape>
-          </w:pict>
-        </mc:Fallback>
-      </mc:AlternateContent>
-    </w:r>
-  </w:p>
-</w:hdr>
 </file>
 
 <file path=word/styles.xml><?xml version="1.0" encoding="utf-8"?>
@@ -1567,6 +1658,18 @@
       <w:rFonts w:ascii="Tw Cen MT" w:hAnsi="Tw Cen MT"/>
     </w:rPr>
   </w:style>
+  <w:style w:type="character" w:styleId="UnresolvedMention">
+    <w:name w:val="Unresolved Mention"/>
+    <w:basedOn w:val="DefaultParagraphFont"/>
+    <w:uiPriority w:val="99"/>
+    <w:semiHidden/>
+    <w:unhideWhenUsed/>
+    <w:rsid w:val="00AC1909"/>
+    <w:rPr>
+      <w:color w:val="605E5C"/>
+      <w:shd w:val="clear" w:color="auto" w:fill="E1DFDD"/>
+    </w:rPr>
+  </w:style>
 </w:styles>
 </file>
 

</xml_diff>

<commit_message>
feat: Add URL field to ResumePersonalInfo model and update related services and editor
</commit_message>
<xml_diff>
--- a/resources/resume/2026 cover letter template.docx
+++ b/resources/resume/2026 cover letter template.docx
@@ -196,7 +196,7 @@
                                 <w:sz w:val="22"/>
                                 <w:u w:val="none"/>
                               </w:rPr>
-                              <w:t>linkedin.com/in/</w:t>
+                              <w:t>{</w:t>
                             </w:r>
                             <w:proofErr w:type="spellStart"/>
                             <w:r>
@@ -206,9 +206,18 @@
                                 <w:sz w:val="22"/>
                                 <w:u w:val="none"/>
                               </w:rPr>
-                              <w:t>jasonvertucio</w:t>
+                              <w:t>url</w:t>
                             </w:r>
                             <w:proofErr w:type="spellEnd"/>
+                            <w:r>
+                              <w:rPr>
+                                <w:rStyle w:val="Hyperlink"/>
+                                <w:color w:val="FFFFFF" w:themeColor="background1"/>
+                                <w:sz w:val="22"/>
+                                <w:u w:val="none"/>
+                              </w:rPr>
+                              <w:t>}</w:t>
+                            </w:r>
                           </w:p>
                           <w:p>
                             <w:pPr>
@@ -378,7 +387,7 @@
                           <w:sz w:val="22"/>
                           <w:u w:val="none"/>
                         </w:rPr>
-                        <w:t>linkedin.com/in/</w:t>
+                        <w:t>{</w:t>
                       </w:r>
                       <w:proofErr w:type="spellStart"/>
                       <w:r>
@@ -388,9 +397,18 @@
                           <w:sz w:val="22"/>
                           <w:u w:val="none"/>
                         </w:rPr>
-                        <w:t>jasonvertucio</w:t>
+                        <w:t>url</w:t>
                       </w:r>
                       <w:proofErr w:type="spellEnd"/>
+                      <w:r>
+                        <w:rPr>
+                          <w:rStyle w:val="Hyperlink"/>
+                          <w:color w:val="FFFFFF" w:themeColor="background1"/>
+                          <w:sz w:val="22"/>
+                          <w:u w:val="none"/>
+                        </w:rPr>
+                        <w:t>}</w:t>
+                      </w:r>
                     </w:p>
                     <w:p>
                       <w:pPr>

</xml_diff>

<commit_message>
feat: enhance document generation with URL handling and placeholder normalization
</commit_message>
<xml_diff>
--- a/resources/resume/2026 cover letter template.docx
+++ b/resources/resume/2026 cover letter template.docx
@@ -5,15 +5,12 @@
     <w:p>
       <w:pPr>
         <w:rPr>
-          <w:sz w:val="24"/>
-          <w:szCs w:val="24"/>
+          <w:rFonts w:ascii="Old Standard TT" w:hAnsi="Old Standard TT"/>
         </w:rPr>
       </w:pPr>
       <w:r>
         <w:rPr>
-          <w:noProof/>
-          <w:sz w:val="24"/>
-          <w:szCs w:val="24"/>
+          <w:rFonts w:ascii="Old Standard TT" w:hAnsi="Old Standard TT"/>
         </w:rPr>
         <mc:AlternateContent>
           <mc:Choice Requires="wps">
@@ -68,24 +65,15 @@
                           <w:p>
                             <w:pPr>
                               <w:pStyle w:val="Title"/>
-                              <w:ind w:left="90"/>
                               <w:rPr>
-                                <w:b/>
-                                <w:bCs/>
+                                <w:rFonts w:ascii="Josefin Sans" w:hAnsi="Josefin Sans"/>
                                 <w:caps/>
-                                <w:color w:val="FFFFFF" w:themeColor="background1"/>
-                                <w:sz w:val="48"/>
-                                <w:szCs w:val="48"/>
                               </w:rPr>
                             </w:pPr>
                             <w:r>
                               <w:rPr>
-                                <w:b/>
-                                <w:bCs/>
+                                <w:rFonts w:ascii="Josefin Sans" w:hAnsi="Josefin Sans"/>
                                 <w:caps/>
-                                <w:color w:val="FFFFFF" w:themeColor="background1"/>
-                                <w:sz w:val="48"/>
-                                <w:szCs w:val="48"/>
                               </w:rPr>
                               <w:t>{name}</w:t>
                             </w:r>
@@ -94,36 +82,38 @@
                             <w:pPr>
                               <w:pStyle w:val="NoSpacing"/>
                               <w:tabs>
-                                <w:tab w:val="left" w:pos="3600"/>
-                                <w:tab w:val="left" w:pos="7920"/>
+                                <w:tab w:val="right" w:pos="11520"/>
                               </w:tabs>
                               <w:ind w:left="90"/>
                               <w:rPr>
+                                <w:rFonts w:ascii="Montserrat" w:hAnsi="Montserrat"/>
                                 <w:color w:val="FFFFFF" w:themeColor="background1"/>
-                                <w:sz w:val="22"/>
+                                <w:szCs w:val="20"/>
                               </w:rPr>
                             </w:pPr>
                             <w:r>
                               <w:rPr>
+                                <w:rFonts w:ascii="Montserrat" w:hAnsi="Montserrat"/>
                                 <w:color w:val="FFFFFF" w:themeColor="background1"/>
-                                <w:sz w:val="22"/>
+                                <w:szCs w:val="20"/>
                               </w:rPr>
                               <w:t>{title}</w:t>
                             </w:r>
                             <w:r>
                               <w:rPr>
                                 <w:rStyle w:val="SubtleReference"/>
-                                <w:rFonts w:ascii="Corbel" w:hAnsi="Corbel"/>
+                                <w:rFonts w:ascii="Montserrat" w:hAnsi="Montserrat"/>
                                 <w:smallCaps w:val="0"/>
                                 <w:color w:val="FFFFFF" w:themeColor="background1"/>
-                                <w:sz w:val="22"/>
+                                <w:szCs w:val="20"/>
                               </w:rPr>
                               <w:tab/>
                             </w:r>
                             <w:r>
                               <w:rPr>
+                                <w:rFonts w:ascii="Montserrat" w:hAnsi="Montserrat"/>
                                 <w:color w:val="FFFFFF" w:themeColor="background1"/>
-                                <w:sz w:val="22"/>
+                                <w:szCs w:val="20"/>
                               </w:rPr>
                               <w:t>{phone}</w:t>
                             </w:r>
@@ -132,68 +122,73 @@
                             <w:pPr>
                               <w:pStyle w:val="NoSpacing"/>
                               <w:tabs>
-                                <w:tab w:val="left" w:pos="3600"/>
-                                <w:tab w:val="left" w:pos="7920"/>
+                                <w:tab w:val="right" w:pos="11520"/>
                               </w:tabs>
                               <w:ind w:left="90"/>
                               <w:rPr>
                                 <w:rStyle w:val="Hyperlink"/>
+                                <w:rFonts w:ascii="Montserrat" w:hAnsi="Montserrat"/>
                                 <w:color w:val="FFFFFF" w:themeColor="background1"/>
-                                <w:sz w:val="22"/>
+                                <w:szCs w:val="20"/>
                               </w:rPr>
                             </w:pPr>
                             <w:r>
                               <w:rPr>
                                 <w:rStyle w:val="SubtleReference"/>
-                                <w:rFonts w:ascii="Corbel" w:hAnsi="Corbel"/>
+                                <w:rFonts w:ascii="Montserrat" w:hAnsi="Montserrat"/>
                                 <w:smallCaps w:val="0"/>
                                 <w:color w:val="FFFFFF" w:themeColor="background1"/>
-                                <w:sz w:val="22"/>
+                                <w:szCs w:val="20"/>
                               </w:rPr>
                               <w:t>{email}</w:t>
                             </w:r>
                             <w:r>
                               <w:rPr>
                                 <w:rStyle w:val="SubtleReference"/>
-                                <w:rFonts w:ascii="Corbel" w:hAnsi="Corbel"/>
+                                <w:rFonts w:ascii="Montserrat" w:hAnsi="Montserrat"/>
                                 <w:smallCaps w:val="0"/>
                                 <w:color w:val="FFFFFF" w:themeColor="background1"/>
-                                <w:sz w:val="22"/>
+                                <w:szCs w:val="20"/>
                               </w:rPr>
                               <w:tab/>
                             </w:r>
                             <w:r>
                               <w:rPr>
+                                <w:rFonts w:ascii="Montserrat" w:hAnsi="Montserrat"/>
                                 <w:color w:val="FFFFFF" w:themeColor="background1"/>
-                                <w:sz w:val="22"/>
+                                <w:szCs w:val="20"/>
                               </w:rPr>
                               <w:fldChar w:fldCharType="begin"/>
                             </w:r>
                             <w:r>
                               <w:rPr>
+                                <w:rFonts w:ascii="Montserrat" w:hAnsi="Montserrat"/>
                                 <w:color w:val="FFFFFF" w:themeColor="background1"/>
-                                <w:sz w:val="22"/>
+                                <w:szCs w:val="20"/>
                               </w:rPr>
                               <w:instrText>HYPERLINK "https://linkedin.com/in/jasonvertucio"</w:instrText>
                             </w:r>
                             <w:r>
                               <w:rPr>
+                                <w:rFonts w:ascii="Montserrat" w:hAnsi="Montserrat"/>
                                 <w:color w:val="FFFFFF" w:themeColor="background1"/>
-                                <w:sz w:val="22"/>
+                                <w:szCs w:val="20"/>
                               </w:rPr>
                             </w:r>
                             <w:r>
                               <w:rPr>
+                                <w:rFonts w:ascii="Montserrat" w:hAnsi="Montserrat"/>
                                 <w:color w:val="FFFFFF" w:themeColor="background1"/>
-                                <w:sz w:val="22"/>
+                                <w:szCs w:val="20"/>
                               </w:rPr>
                               <w:fldChar w:fldCharType="separate"/>
                             </w:r>
                             <w:r>
                               <w:rPr>
                                 <w:rStyle w:val="Hyperlink"/>
+                                <w:rFonts w:ascii="Montserrat" w:hAnsi="Montserrat"/>
                                 <w:color w:val="FFFFFF" w:themeColor="background1"/>
-                                <w:sz w:val="22"/>
+                                <w:szCs w:val="20"/>
                                 <w:u w:val="none"/>
                               </w:rPr>
                               <w:t>{</w:t>
@@ -202,8 +197,9 @@
                             <w:r>
                               <w:rPr>
                                 <w:rStyle w:val="Hyperlink"/>
+                                <w:rFonts w:ascii="Montserrat" w:hAnsi="Montserrat"/>
                                 <w:color w:val="FFFFFF" w:themeColor="background1"/>
-                                <w:sz w:val="22"/>
+                                <w:szCs w:val="20"/>
                                 <w:u w:val="none"/>
                               </w:rPr>
                               <w:t>url</w:t>
@@ -212,8 +208,9 @@
                             <w:r>
                               <w:rPr>
                                 <w:rStyle w:val="Hyperlink"/>
+                                <w:rFonts w:ascii="Montserrat" w:hAnsi="Montserrat"/>
                                 <w:color w:val="FFFFFF" w:themeColor="background1"/>
-                                <w:sz w:val="22"/>
+                                <w:szCs w:val="20"/>
                                 <w:u w:val="none"/>
                               </w:rPr>
                               <w:t>}</w:t>
@@ -221,12 +218,14 @@
                           </w:p>
                           <w:p>
                             <w:pPr>
-                              <w:jc w:val="center"/>
+                              <w:tabs>
+                                <w:tab w:val="left" w:pos="11520"/>
+                              </w:tabs>
                             </w:pPr>
                             <w:r>
                               <w:rPr>
-                                <w:color w:val="FFFFFF" w:themeColor="background1"/>
-                                <w:sz w:val="22"/>
+                                <w:sz w:val="20"/>
+                                <w:szCs w:val="20"/>
                               </w:rPr>
                               <w:fldChar w:fldCharType="end"/>
                             </w:r>
@@ -259,24 +258,15 @@
                     <w:p>
                       <w:pPr>
                         <w:pStyle w:val="Title"/>
-                        <w:ind w:left="90"/>
                         <w:rPr>
-                          <w:b/>
-                          <w:bCs/>
+                          <w:rFonts w:ascii="Josefin Sans" w:hAnsi="Josefin Sans"/>
                           <w:caps/>
-                          <w:color w:val="FFFFFF" w:themeColor="background1"/>
-                          <w:sz w:val="48"/>
-                          <w:szCs w:val="48"/>
                         </w:rPr>
                       </w:pPr>
                       <w:r>
                         <w:rPr>
-                          <w:b/>
-                          <w:bCs/>
+                          <w:rFonts w:ascii="Josefin Sans" w:hAnsi="Josefin Sans"/>
                           <w:caps/>
-                          <w:color w:val="FFFFFF" w:themeColor="background1"/>
-                          <w:sz w:val="48"/>
-                          <w:szCs w:val="48"/>
                         </w:rPr>
                         <w:t>{name}</w:t>
                       </w:r>
@@ -285,36 +275,38 @@
                       <w:pPr>
                         <w:pStyle w:val="NoSpacing"/>
                         <w:tabs>
-                          <w:tab w:val="left" w:pos="3600"/>
-                          <w:tab w:val="left" w:pos="7920"/>
+                          <w:tab w:val="right" w:pos="11520"/>
                         </w:tabs>
                         <w:ind w:left="90"/>
                         <w:rPr>
+                          <w:rFonts w:ascii="Montserrat" w:hAnsi="Montserrat"/>
                           <w:color w:val="FFFFFF" w:themeColor="background1"/>
-                          <w:sz w:val="22"/>
+                          <w:szCs w:val="20"/>
                         </w:rPr>
                       </w:pPr>
                       <w:r>
                         <w:rPr>
+                          <w:rFonts w:ascii="Montserrat" w:hAnsi="Montserrat"/>
                           <w:color w:val="FFFFFF" w:themeColor="background1"/>
-                          <w:sz w:val="22"/>
+                          <w:szCs w:val="20"/>
                         </w:rPr>
                         <w:t>{title}</w:t>
                       </w:r>
                       <w:r>
                         <w:rPr>
                           <w:rStyle w:val="SubtleReference"/>
-                          <w:rFonts w:ascii="Corbel" w:hAnsi="Corbel"/>
+                          <w:rFonts w:ascii="Montserrat" w:hAnsi="Montserrat"/>
                           <w:smallCaps w:val="0"/>
                           <w:color w:val="FFFFFF" w:themeColor="background1"/>
-                          <w:sz w:val="22"/>
+                          <w:szCs w:val="20"/>
                         </w:rPr>
                         <w:tab/>
                       </w:r>
                       <w:r>
                         <w:rPr>
+                          <w:rFonts w:ascii="Montserrat" w:hAnsi="Montserrat"/>
                           <w:color w:val="FFFFFF" w:themeColor="background1"/>
-                          <w:sz w:val="22"/>
+                          <w:szCs w:val="20"/>
                         </w:rPr>
                         <w:t>{phone}</w:t>
                       </w:r>
@@ -323,68 +315,73 @@
                       <w:pPr>
                         <w:pStyle w:val="NoSpacing"/>
                         <w:tabs>
-                          <w:tab w:val="left" w:pos="3600"/>
-                          <w:tab w:val="left" w:pos="7920"/>
+                          <w:tab w:val="right" w:pos="11520"/>
                         </w:tabs>
                         <w:ind w:left="90"/>
                         <w:rPr>
                           <w:rStyle w:val="Hyperlink"/>
+                          <w:rFonts w:ascii="Montserrat" w:hAnsi="Montserrat"/>
                           <w:color w:val="FFFFFF" w:themeColor="background1"/>
-                          <w:sz w:val="22"/>
+                          <w:szCs w:val="20"/>
                         </w:rPr>
                       </w:pPr>
                       <w:r>
                         <w:rPr>
                           <w:rStyle w:val="SubtleReference"/>
-                          <w:rFonts w:ascii="Corbel" w:hAnsi="Corbel"/>
+                          <w:rFonts w:ascii="Montserrat" w:hAnsi="Montserrat"/>
                           <w:smallCaps w:val="0"/>
                           <w:color w:val="FFFFFF" w:themeColor="background1"/>
-                          <w:sz w:val="22"/>
+                          <w:szCs w:val="20"/>
                         </w:rPr>
                         <w:t>{email}</w:t>
                       </w:r>
                       <w:r>
                         <w:rPr>
                           <w:rStyle w:val="SubtleReference"/>
-                          <w:rFonts w:ascii="Corbel" w:hAnsi="Corbel"/>
+                          <w:rFonts w:ascii="Montserrat" w:hAnsi="Montserrat"/>
                           <w:smallCaps w:val="0"/>
                           <w:color w:val="FFFFFF" w:themeColor="background1"/>
-                          <w:sz w:val="22"/>
+                          <w:szCs w:val="20"/>
                         </w:rPr>
                         <w:tab/>
                       </w:r>
                       <w:r>
                         <w:rPr>
+                          <w:rFonts w:ascii="Montserrat" w:hAnsi="Montserrat"/>
                           <w:color w:val="FFFFFF" w:themeColor="background1"/>
-                          <w:sz w:val="22"/>
+                          <w:szCs w:val="20"/>
                         </w:rPr>
                         <w:fldChar w:fldCharType="begin"/>
                       </w:r>
                       <w:r>
                         <w:rPr>
+                          <w:rFonts w:ascii="Montserrat" w:hAnsi="Montserrat"/>
                           <w:color w:val="FFFFFF" w:themeColor="background1"/>
-                          <w:sz w:val="22"/>
+                          <w:szCs w:val="20"/>
                         </w:rPr>
                         <w:instrText>HYPERLINK "https://linkedin.com/in/jasonvertucio"</w:instrText>
                       </w:r>
                       <w:r>
                         <w:rPr>
+                          <w:rFonts w:ascii="Montserrat" w:hAnsi="Montserrat"/>
                           <w:color w:val="FFFFFF" w:themeColor="background1"/>
-                          <w:sz w:val="22"/>
+                          <w:szCs w:val="20"/>
                         </w:rPr>
                       </w:r>
                       <w:r>
                         <w:rPr>
+                          <w:rFonts w:ascii="Montserrat" w:hAnsi="Montserrat"/>
                           <w:color w:val="FFFFFF" w:themeColor="background1"/>
-                          <w:sz w:val="22"/>
+                          <w:szCs w:val="20"/>
                         </w:rPr>
                         <w:fldChar w:fldCharType="separate"/>
                       </w:r>
                       <w:r>
                         <w:rPr>
                           <w:rStyle w:val="Hyperlink"/>
+                          <w:rFonts w:ascii="Montserrat" w:hAnsi="Montserrat"/>
                           <w:color w:val="FFFFFF" w:themeColor="background1"/>
-                          <w:sz w:val="22"/>
+                          <w:szCs w:val="20"/>
                           <w:u w:val="none"/>
                         </w:rPr>
                         <w:t>{</w:t>
@@ -393,8 +390,9 @@
                       <w:r>
                         <w:rPr>
                           <w:rStyle w:val="Hyperlink"/>
+                          <w:rFonts w:ascii="Montserrat" w:hAnsi="Montserrat"/>
                           <w:color w:val="FFFFFF" w:themeColor="background1"/>
-                          <w:sz w:val="22"/>
+                          <w:szCs w:val="20"/>
                           <w:u w:val="none"/>
                         </w:rPr>
                         <w:t>url</w:t>
@@ -403,8 +401,9 @@
                       <w:r>
                         <w:rPr>
                           <w:rStyle w:val="Hyperlink"/>
+                          <w:rFonts w:ascii="Montserrat" w:hAnsi="Montserrat"/>
                           <w:color w:val="FFFFFF" w:themeColor="background1"/>
-                          <w:sz w:val="22"/>
+                          <w:szCs w:val="20"/>
                           <w:u w:val="none"/>
                         </w:rPr>
                         <w:t>}</w:t>
@@ -412,12 +411,14 @@
                     </w:p>
                     <w:p>
                       <w:pPr>
-                        <w:jc w:val="center"/>
+                        <w:tabs>
+                          <w:tab w:val="left" w:pos="11520"/>
+                        </w:tabs>
                       </w:pPr>
                       <w:r>
                         <w:rPr>
-                          <w:color w:val="FFFFFF" w:themeColor="background1"/>
-                          <w:sz w:val="22"/>
+                          <w:sz w:val="20"/>
+                          <w:szCs w:val="20"/>
                         </w:rPr>
                         <w:fldChar w:fldCharType="end"/>
                       </w:r>
@@ -432,8 +433,7 @@
       </w:r>
       <w:r>
         <w:rPr>
-          <w:sz w:val="24"/>
-          <w:szCs w:val="24"/>
+          <w:rFonts w:ascii="Old Standard TT" w:hAnsi="Old Standard TT"/>
         </w:rPr>
         <w:t>{date}</w:t>
       </w:r>
@@ -441,68 +441,46 @@
     <w:p>
       <w:pPr>
         <w:rPr>
-          <w:sz w:val="24"/>
-          <w:szCs w:val="24"/>
+          <w:rFonts w:ascii="Old Standard TT" w:hAnsi="Old Standard TT"/>
         </w:rPr>
       </w:pPr>
       <w:r>
         <w:rPr>
-          <w:sz w:val="24"/>
-          <w:szCs w:val="24"/>
+          <w:rFonts w:ascii="Old Standard TT" w:hAnsi="Old Standard TT"/>
         </w:rPr>
-        <w:t>{</w:t>
-      </w:r>
-      <w:proofErr w:type="spellStart"/>
-      <w:r>
-        <w:rPr>
-          <w:sz w:val="24"/>
-          <w:szCs w:val="24"/>
-        </w:rPr>
-        <w:t>companyAddress</w:t>
-      </w:r>
-      <w:proofErr w:type="spellEnd"/>
-      <w:r>
-        <w:rPr>
-          <w:sz w:val="24"/>
-          <w:szCs w:val="24"/>
-        </w:rPr>
-        <w:t>}</w:t>
+        <w:t>{companyAddress}</w:t>
       </w:r>
     </w:p>
     <w:p>
       <w:pPr>
         <w:rPr>
-          <w:sz w:val="24"/>
-          <w:szCs w:val="24"/>
+          <w:rFonts w:ascii="Old Standard TT" w:hAnsi="Old Standard TT"/>
         </w:rPr>
       </w:pPr>
     </w:p>
     <w:p>
       <w:pPr>
         <w:rPr>
-          <w:sz w:val="24"/>
-          <w:szCs w:val="24"/>
+          <w:rFonts w:ascii="Old Standard TT" w:hAnsi="Old Standard TT"/>
         </w:rPr>
       </w:pPr>
       <w:r>
         <w:rPr>
-          <w:sz w:val="24"/>
-          <w:szCs w:val="24"/>
+          <w:rFonts w:ascii="Old Standard TT" w:hAnsi="Old Standard TT"/>
         </w:rPr>
         <w:t>{greeting}</w:t>
       </w:r>
     </w:p>
     <w:p>
       <w:pPr>
+        <w:spacing w:line="288" w:lineRule="auto"/>
         <w:rPr>
-          <w:sz w:val="24"/>
-          <w:szCs w:val="24"/>
+          <w:rFonts w:ascii="Old Standard TT" w:hAnsi="Old Standard TT"/>
         </w:rPr>
       </w:pPr>
       <w:r>
         <w:rPr>
-          <w:sz w:val="24"/>
-          <w:szCs w:val="24"/>
+          <w:rFonts w:ascii="Old Standard TT" w:hAnsi="Old Standard TT"/>
         </w:rPr>
         <w:t>{@messageBody}</w:t>
       </w:r>
@@ -510,29 +488,25 @@
     <w:p>
       <w:pPr>
         <w:rPr>
-          <w:sz w:val="24"/>
-          <w:szCs w:val="24"/>
+          <w:rFonts w:ascii="Old Standard TT" w:hAnsi="Old Standard TT"/>
         </w:rPr>
       </w:pPr>
       <w:r>
         <w:rPr>
-          <w:sz w:val="24"/>
-          <w:szCs w:val="24"/>
+          <w:rFonts w:ascii="Old Standard TT" w:hAnsi="Old Standard TT"/>
         </w:rPr>
         <w:t>{closing}</w:t>
       </w:r>
     </w:p>
     <w:p>
       <w:pPr>
-        <w:spacing w:after="0"/>
         <w:rPr>
-          <w:sz w:val="24"/>
-          <w:szCs w:val="24"/>
+          <w:rFonts w:ascii="Old Standard TT" w:hAnsi="Old Standard TT"/>
         </w:rPr>
       </w:pPr>
       <w:r>
         <w:rPr>
-          <w:noProof/>
+          <w:rFonts w:ascii="Old Standard TT" w:hAnsi="Old Standard TT"/>
         </w:rPr>
         <w:drawing>
           <wp:inline distT="0" distB="0" distL="0" distR="0" wp14:anchorId="7CBDC097" wp14:editId="7206D14C">
@@ -596,16 +570,13 @@
     </w:p>
     <w:p>
       <w:pPr>
-        <w:spacing w:line="240" w:lineRule="auto"/>
         <w:rPr>
-          <w:sz w:val="24"/>
-          <w:szCs w:val="24"/>
+          <w:rFonts w:ascii="Old Standard TT" w:hAnsi="Old Standard TT"/>
         </w:rPr>
       </w:pPr>
       <w:r>
         <w:rPr>
-          <w:sz w:val="24"/>
-          <w:szCs w:val="24"/>
+          <w:rFonts w:ascii="Old Standard TT" w:hAnsi="Old Standard TT"/>
         </w:rPr>
         <w:t>{signature}</w:t>
       </w:r>
@@ -625,9 +596,6 @@
 <w:endnotes xmlns:wpc="http://schemas.microsoft.com/office/word/2010/wordprocessingCanvas" xmlns:cx="http://schemas.microsoft.com/office/drawing/2014/chartex" xmlns:cx1="http://schemas.microsoft.com/office/drawing/2015/9/8/chartex" xmlns:cx2="http://schemas.microsoft.com/office/drawing/2015/10/21/chartex" xmlns:cx3="http://schemas.microsoft.com/office/drawing/2016/5/9/chartex" xmlns:cx4="http://schemas.microsoft.com/office/drawing/2016/5/10/chartex" xmlns:cx5="http://schemas.microsoft.com/office/drawing/2016/5/11/chartex" xmlns:cx6="http://schemas.microsoft.com/office/drawing/2016/5/12/chartex" xmlns:cx7="http://schemas.microsoft.com/office/drawing/2016/5/13/chartex" xmlns:cx8="http://schemas.microsoft.com/office/drawing/2016/5/14/chartex" xmlns:mc="http://schemas.openxmlformats.org/markup-compatibility/2006" xmlns:aink="http://schemas.microsoft.com/office/drawing/2016/ink" xmlns:am3d="http://schemas.microsoft.com/office/drawing/2017/model3d" xmlns:o="urn:schemas-microsoft-com:office:office" xmlns:oel="http://schemas.microsoft.com/office/2019/extlst" xmlns:r="http://schemas.openxmlformats.org/officeDocument/2006/relationships" xmlns:m="http://schemas.openxmlformats.org/officeDocument/2006/math" xmlns:v="urn:schemas-microsoft-com:vml" xmlns:wp14="http://schemas.microsoft.com/office/word/2010/wordprocessingDrawing" xmlns:wp="http://schemas.openxmlformats.org/drawingml/2006/wordprocessingDrawing" xmlns:w10="urn:schemas-microsoft-com:office:word" xmlns:w="http://schemas.openxmlformats.org/wordprocessingml/2006/main" xmlns:w14="http://schemas.microsoft.com/office/word/2010/wordml" xmlns:w15="http://schemas.microsoft.com/office/word/2012/wordml" xmlns:w16cex="http://schemas.microsoft.com/office/word/2018/wordml/cex" xmlns:w16cid="http://schemas.microsoft.com/office/word/2016/wordml/cid" xmlns:w16="http://schemas.microsoft.com/office/word/2018/wordml" xmlns:w16du="http://schemas.microsoft.com/office/word/2023/wordml/word16du" xmlns:w16sdtdh="http://schemas.microsoft.com/office/word/2020/wordml/sdtdatahash" xmlns:w16sdtfl="http://schemas.microsoft.com/office/word/2024/wordml/sdtformatlock" xmlns:w16se="http://schemas.microsoft.com/office/word/2015/wordml/symex" xmlns:wpg="http://schemas.microsoft.com/office/word/2010/wordprocessingGroup" xmlns:wpi="http://schemas.microsoft.com/office/word/2010/wordprocessingInk" xmlns:wne="http://schemas.microsoft.com/office/word/2006/wordml" xmlns:wps="http://schemas.microsoft.com/office/word/2010/wordprocessingShape" mc:Ignorable="w14 w15 w16se w16cid w16 w16cex w16sdtdh w16sdtfl w16du wp14">
   <w:endnote w:type="separator" w:id="-1">
     <w:p>
-      <w:pPr>
-        <w:spacing w:after="0" w:line="240" w:lineRule="auto"/>
-      </w:pPr>
       <w:r>
         <w:separator/>
       </w:r>
@@ -635,9 +603,6 @@
   </w:endnote>
   <w:endnote w:type="continuationSeparator" w:id="0">
     <w:p>
-      <w:pPr>
-        <w:spacing w:after="0" w:line="240" w:lineRule="auto"/>
-      </w:pPr>
       <w:r>
         <w:continuationSeparator/>
       </w:r>
@@ -650,9 +615,6 @@
 <w:footnotes xmlns:wpc="http://schemas.microsoft.com/office/word/2010/wordprocessingCanvas" xmlns:cx="http://schemas.microsoft.com/office/drawing/2014/chartex" xmlns:cx1="http://schemas.microsoft.com/office/drawing/2015/9/8/chartex" xmlns:cx2="http://schemas.microsoft.com/office/drawing/2015/10/21/chartex" xmlns:cx3="http://schemas.microsoft.com/office/drawing/2016/5/9/chartex" xmlns:cx4="http://schemas.microsoft.com/office/drawing/2016/5/10/chartex" xmlns:cx5="http://schemas.microsoft.com/office/drawing/2016/5/11/chartex" xmlns:cx6="http://schemas.microsoft.com/office/drawing/2016/5/12/chartex" xmlns:cx7="http://schemas.microsoft.com/office/drawing/2016/5/13/chartex" xmlns:cx8="http://schemas.microsoft.com/office/drawing/2016/5/14/chartex" xmlns:mc="http://schemas.openxmlformats.org/markup-compatibility/2006" xmlns:aink="http://schemas.microsoft.com/office/drawing/2016/ink" xmlns:am3d="http://schemas.microsoft.com/office/drawing/2017/model3d" xmlns:o="urn:schemas-microsoft-com:office:office" xmlns:oel="http://schemas.microsoft.com/office/2019/extlst" xmlns:r="http://schemas.openxmlformats.org/officeDocument/2006/relationships" xmlns:m="http://schemas.openxmlformats.org/officeDocument/2006/math" xmlns:v="urn:schemas-microsoft-com:vml" xmlns:wp14="http://schemas.microsoft.com/office/word/2010/wordprocessingDrawing" xmlns:wp="http://schemas.openxmlformats.org/drawingml/2006/wordprocessingDrawing" xmlns:w10="urn:schemas-microsoft-com:office:word" xmlns:w="http://schemas.openxmlformats.org/wordprocessingml/2006/main" xmlns:w14="http://schemas.microsoft.com/office/word/2010/wordml" xmlns:w15="http://schemas.microsoft.com/office/word/2012/wordml" xmlns:w16cex="http://schemas.microsoft.com/office/word/2018/wordml/cex" xmlns:w16cid="http://schemas.microsoft.com/office/word/2016/wordml/cid" xmlns:w16="http://schemas.microsoft.com/office/word/2018/wordml" xmlns:w16du="http://schemas.microsoft.com/office/word/2023/wordml/word16du" xmlns:w16sdtdh="http://schemas.microsoft.com/office/word/2020/wordml/sdtdatahash" xmlns:w16sdtfl="http://schemas.microsoft.com/office/word/2024/wordml/sdtformatlock" xmlns:w16se="http://schemas.microsoft.com/office/word/2015/wordml/symex" xmlns:wpg="http://schemas.microsoft.com/office/word/2010/wordprocessingGroup" xmlns:wpi="http://schemas.microsoft.com/office/word/2010/wordprocessingInk" xmlns:wne="http://schemas.microsoft.com/office/word/2006/wordml" xmlns:wps="http://schemas.microsoft.com/office/word/2010/wordprocessingShape" mc:Ignorable="w14 w15 w16se w16cid w16 w16cex w16sdtdh w16sdtfl w16du wp14">
   <w:footnote w:type="separator" w:id="-1">
     <w:p>
-      <w:pPr>
-        <w:spacing w:after="0" w:line="240" w:lineRule="auto"/>
-      </w:pPr>
       <w:r>
         <w:separator/>
       </w:r>
@@ -660,9 +622,6 @@
   </w:footnote>
   <w:footnote w:type="continuationSeparator" w:id="0">
     <w:p>
-      <w:pPr>
-        <w:spacing w:after="0" w:line="240" w:lineRule="auto"/>
-      </w:pPr>
       <w:r>
         <w:continuationSeparator/>
       </w:r>
@@ -1071,10 +1030,10 @@
   <w:style w:type="paragraph" w:default="1" w:styleId="Normal">
     <w:name w:val="Normal"/>
     <w:qFormat/>
-    <w:rsid w:val="007F3F30"/>
-    <w:rPr>
-      <w:rFonts w:ascii="Corbel" w:hAnsi="Corbel"/>
-      <w:sz w:val="20"/>
+    <w:rsid w:val="001C50CA"/>
+    <w:rPr>
+      <w:rFonts w:ascii="Montserrat" w:hAnsi="Montserrat"/>
+      <w:noProof/>
     </w:rPr>
   </w:style>
   <w:style w:type="paragraph" w:styleId="Heading1">

</xml_diff>

<commit_message>
chore: update cover letter and resume templates
</commit_message>
<xml_diff>
--- a/resources/resume/2026 cover letter template.docx
+++ b/resources/resume/2026 cover letter template.docx
@@ -5,14 +5,14 @@
     <w:p>
       <w:pPr>
         <w:rPr>
-          <w:sz w:val="24"/>
-          <w:szCs w:val="24"/>
+          <w:rFonts w:ascii="Montserrat" w:hAnsi="Montserrat"/>
+          <w:szCs w:val="20"/>
         </w:rPr>
       </w:pPr>
       <w:r>
         <w:rPr>
-          <w:sz w:val="24"/>
-          <w:szCs w:val="24"/>
+          <w:rFonts w:ascii="Montserrat" w:hAnsi="Montserrat"/>
+          <w:szCs w:val="20"/>
         </w:rPr>
         <w:t>{date}</w:t>
       </w:r>
@@ -20,30 +20,30 @@
     <w:p>
       <w:pPr>
         <w:rPr>
-          <w:sz w:val="24"/>
-          <w:szCs w:val="24"/>
+          <w:rFonts w:ascii="Montserrat" w:hAnsi="Montserrat"/>
+          <w:szCs w:val="20"/>
         </w:rPr>
       </w:pPr>
       <w:r>
         <w:rPr>
-          <w:sz w:val="24"/>
-          <w:szCs w:val="24"/>
+          <w:rFonts w:ascii="Montserrat" w:hAnsi="Montserrat"/>
+          <w:szCs w:val="20"/>
         </w:rPr>
         <w:t>{</w:t>
       </w:r>
       <w:proofErr w:type="spellStart"/>
       <w:r>
         <w:rPr>
-          <w:sz w:val="24"/>
-          <w:szCs w:val="24"/>
+          <w:rFonts w:ascii="Montserrat" w:hAnsi="Montserrat"/>
+          <w:szCs w:val="20"/>
         </w:rPr>
         <w:t>companyAddress</w:t>
       </w:r>
       <w:proofErr w:type="spellEnd"/>
       <w:r>
         <w:rPr>
-          <w:sz w:val="24"/>
-          <w:szCs w:val="24"/>
+          <w:rFonts w:ascii="Montserrat" w:hAnsi="Montserrat"/>
+          <w:szCs w:val="20"/>
         </w:rPr>
         <w:t>}</w:t>
       </w:r>
@@ -51,14 +51,14 @@
     <w:p>
       <w:pPr>
         <w:rPr>
-          <w:sz w:val="24"/>
-          <w:szCs w:val="24"/>
+          <w:rFonts w:ascii="Montserrat" w:hAnsi="Montserrat"/>
+          <w:szCs w:val="20"/>
         </w:rPr>
       </w:pPr>
       <w:r>
         <w:rPr>
-          <w:sz w:val="24"/>
-          <w:szCs w:val="24"/>
+          <w:rFonts w:ascii="Montserrat" w:hAnsi="Montserrat"/>
+          <w:szCs w:val="20"/>
         </w:rPr>
         <w:t>{greeting}</w:t>
       </w:r>
@@ -66,53 +66,37 @@
     <w:p>
       <w:pPr>
         <w:rPr>
-          <w:sz w:val="24"/>
-          <w:szCs w:val="24"/>
+          <w:rFonts w:ascii="Montserrat" w:hAnsi="Montserrat"/>
+          <w:szCs w:val="20"/>
         </w:rPr>
       </w:pPr>
       <w:r>
         <w:rPr>
-          <w:sz w:val="24"/>
-          <w:szCs w:val="24"/>
+          <w:rFonts w:ascii="Montserrat" w:hAnsi="Montserrat"/>
+          <w:szCs w:val="20"/>
         </w:rPr>
-        <w:t>{@</w:t>
-      </w:r>
-      <w:proofErr w:type="spellStart"/>
-      <w:r>
-        <w:rPr>
-          <w:sz w:val="24"/>
-          <w:szCs w:val="24"/>
-        </w:rPr>
-        <w:t>messageBody</w:t>
-      </w:r>
-      <w:proofErr w:type="spellEnd"/>
-      <w:r>
-        <w:rPr>
-          <w:sz w:val="24"/>
-          <w:szCs w:val="24"/>
-        </w:rPr>
-        <w:t>}</w:t>
+        <w:t>{@messageBody}</w:t>
       </w:r>
     </w:p>
     <w:p>
       <w:pPr>
         <w:rPr>
-          <w:sz w:val="24"/>
-          <w:szCs w:val="24"/>
+          <w:rFonts w:ascii="Montserrat" w:hAnsi="Montserrat"/>
+          <w:szCs w:val="20"/>
         </w:rPr>
       </w:pPr>
     </w:p>
     <w:p>
       <w:pPr>
         <w:rPr>
-          <w:sz w:val="24"/>
-          <w:szCs w:val="24"/>
+          <w:rFonts w:ascii="Montserrat" w:hAnsi="Montserrat"/>
+          <w:szCs w:val="20"/>
         </w:rPr>
       </w:pPr>
       <w:r>
         <w:rPr>
-          <w:sz w:val="24"/>
-          <w:szCs w:val="24"/>
+          <w:rFonts w:ascii="Montserrat" w:hAnsi="Montserrat"/>
+          <w:szCs w:val="20"/>
         </w:rPr>
         <w:t>{closing}</w:t>
       </w:r>
@@ -120,30 +104,90 @@
     <w:p>
       <w:pPr>
         <w:rPr>
-          <w:sz w:val="24"/>
-          <w:szCs w:val="24"/>
+          <w:rFonts w:ascii="Montserrat" w:hAnsi="Montserrat"/>
+          <w:szCs w:val="20"/>
         </w:rPr>
       </w:pPr>
+      <w:r>
+        <w:drawing>
+          <wp:inline distT="0" distB="0" distL="0" distR="0" wp14:anchorId="5ED6DE7A" wp14:editId="7421C888">
+            <wp:extent cx="828675" cy="1725075"/>
+            <wp:effectExtent l="0" t="0" r="0" b="8890"/>
+            <wp:docPr id="930496902" name="Picture 2"/>
+            <wp:cNvGraphicFramePr>
+              <a:graphicFrameLocks xmlns:a="http://schemas.openxmlformats.org/drawingml/2006/main" noChangeAspect="1"/>
+            </wp:cNvGraphicFramePr>
+            <a:graphic xmlns:a="http://schemas.openxmlformats.org/drawingml/2006/main">
+              <a:graphicData uri="http://schemas.openxmlformats.org/drawingml/2006/picture">
+                <pic:pic xmlns:pic="http://schemas.openxmlformats.org/drawingml/2006/picture">
+                  <pic:nvPicPr>
+                    <pic:cNvPr id="0" name="Picture 1"/>
+                    <pic:cNvPicPr>
+                      <a:picLocks noChangeAspect="1" noChangeArrowheads="1"/>
+                    </pic:cNvPicPr>
+                  </pic:nvPicPr>
+                  <pic:blipFill>
+                    <a:blip r:embed="rId6" cstate="print">
+                      <a:alphaModFix/>
+                      <a:extLst>
+                        <a:ext uri="{BEBA8EAE-BF5A-486C-A8C5-ECC9F3942E4B}">
+                          <a14:imgProps xmlns:a14="http://schemas.microsoft.com/office/drawing/2010/main">
+                            <a14:imgLayer r:embed="rId7">
+                              <a14:imgEffect>
+                                <a14:brightnessContrast bright="-25000" contrast="100000"/>
+                              </a14:imgEffect>
+                            </a14:imgLayer>
+                          </a14:imgProps>
+                        </a:ext>
+                        <a:ext uri="{28A0092B-C50C-407E-A947-70E740481C1C}">
+                          <a14:useLocalDpi xmlns:a14="http://schemas.microsoft.com/office/drawing/2010/main" val="0"/>
+                        </a:ext>
+                      </a:extLst>
+                    </a:blip>
+                    <a:srcRect/>
+                    <a:stretch>
+                      <a:fillRect/>
+                    </a:stretch>
+                  </pic:blipFill>
+                  <pic:spPr bwMode="auto">
+                    <a:xfrm>
+                      <a:off x="0" y="0"/>
+                      <a:ext cx="838680" cy="1745903"/>
+                    </a:xfrm>
+                    <a:prstGeom prst="rect">
+                      <a:avLst/>
+                    </a:prstGeom>
+                    <a:noFill/>
+                    <a:ln>
+                      <a:noFill/>
+                    </a:ln>
+                  </pic:spPr>
+                </pic:pic>
+              </a:graphicData>
+            </a:graphic>
+          </wp:inline>
+        </w:drawing>
+      </w:r>
     </w:p>
     <w:p>
       <w:pPr>
         <w:rPr>
-          <w:sz w:val="24"/>
-          <w:szCs w:val="24"/>
+          <w:rFonts w:ascii="Montserrat" w:hAnsi="Montserrat"/>
+          <w:szCs w:val="20"/>
         </w:rPr>
       </w:pPr>
       <w:r>
         <w:rPr>
-          <w:sz w:val="24"/>
-          <w:szCs w:val="24"/>
+          <w:rFonts w:ascii="Montserrat" w:hAnsi="Montserrat"/>
+          <w:szCs w:val="20"/>
         </w:rPr>
         <w:t>{signature}</w:t>
       </w:r>
     </w:p>
     <w:sectPr>
-      <w:headerReference w:type="default" r:id="rId6"/>
+      <w:headerReference w:type="default" r:id="rId8"/>
       <w:pgSz w:w="12240" w:h="15840"/>
-      <w:pgMar w:top="1620" w:right="720" w:bottom="720" w:left="720" w:header="90" w:footer="720" w:gutter="0"/>
+      <w:pgMar w:top="1260" w:right="720" w:bottom="720" w:left="720" w:header="90" w:footer="720" w:gutter="0"/>
       <w:cols w:space="720"/>
       <w:docGrid w:linePitch="360"/>
     </w:sectPr>
@@ -218,21 +262,21 @@
       <mc:AlternateContent>
         <mc:Choice Requires="wps">
           <w:drawing>
-            <wp:anchor distT="0" distB="0" distL="114300" distR="114300" simplePos="0" relativeHeight="251659264" behindDoc="1" locked="0" layoutInCell="1" allowOverlap="0" wp14:anchorId="09AB09E3" wp14:editId="6090E7AA">
+            <wp:anchor distT="0" distB="0" distL="114300" distR="114300" simplePos="0" relativeHeight="251659264" behindDoc="1" locked="0" layoutInCell="1" allowOverlap="0" wp14:anchorId="09AB09E3" wp14:editId="0CE5FA50">
               <wp:simplePos x="0" y="0"/>
               <wp:positionH relativeFrom="page">
-                <wp:posOffset>7814</wp:posOffset>
+                <wp:posOffset>9525</wp:posOffset>
               </wp:positionH>
               <wp:positionV relativeFrom="page">
-                <wp:posOffset>-15631</wp:posOffset>
+                <wp:posOffset>-19049</wp:posOffset>
               </wp:positionV>
-              <wp:extent cx="7885723" cy="1033272"/>
+              <wp:extent cx="7885723" cy="742950"/>
               <wp:effectExtent l="0" t="0" r="1270" b="0"/>
               <wp:wrapTight wrapText="bothSides">
                 <wp:wrapPolygon edited="0">
                   <wp:start x="0" y="0"/>
-                  <wp:lineTo x="0" y="21109"/>
-                  <wp:lineTo x="21551" y="21109"/>
+                  <wp:lineTo x="0" y="21046"/>
+                  <wp:lineTo x="21551" y="21046"/>
                   <wp:lineTo x="21551" y="0"/>
                   <wp:lineTo x="0" y="0"/>
                 </wp:wrapPolygon>
@@ -246,7 +290,7 @@
                     <wps:spPr>
                       <a:xfrm>
                         <a:off x="0" y="0"/>
-                        <a:ext cx="7885723" cy="1033272"/>
+                        <a:ext cx="7885723" cy="742950"/>
                       </a:xfrm>
                       <a:prstGeom prst="rect">
                         <a:avLst/>
@@ -274,18 +318,29 @@
                         <w:p>
                           <w:pPr>
                             <w:pStyle w:val="Title"/>
+                            <w:tabs>
+                              <w:tab w:val="left" w:pos="7200"/>
+                            </w:tabs>
                             <w:ind w:left="90"/>
                             <w:rPr>
+                              <w:rFonts w:ascii="Josefin Sans Bold" w:hAnsi="Josefin Sans Bold"/>
                               <w:b/>
                               <w:bCs/>
+                              <w:caps/>
+                              <w:sz w:val="40"/>
+                              <w:szCs w:val="40"/>
                             </w:rPr>
                           </w:pPr>
                           <w:r>
                             <w:rPr>
+                              <w:rFonts w:ascii="Josefin Sans Bold" w:hAnsi="Josefin Sans Bold"/>
                               <w:b/>
                               <w:bCs/>
+                              <w:caps/>
+                              <w:sz w:val="40"/>
+                              <w:szCs w:val="40"/>
                             </w:rPr>
-                            <w:t>JASON VERTUCIO</w:t>
+                            <w:t>{name}</w:t>
                           </w:r>
                         </w:p>
                         <w:p>
@@ -293,34 +348,47 @@
                             <w:pStyle w:val="NoSpacing"/>
                             <w:tabs>
                               <w:tab w:val="left" w:pos="3600"/>
+                              <w:tab w:val="left" w:pos="7200"/>
                               <w:tab w:val="left" w:pos="7920"/>
                             </w:tabs>
                             <w:ind w:left="90"/>
                             <w:rPr>
+                              <w:rFonts w:ascii="Montserrat" w:hAnsi="Montserrat"/>
                               <w:b/>
                               <w:bCs/>
                             </w:rPr>
                           </w:pPr>
                           <w:r>
                             <w:rPr>
+                              <w:rFonts w:ascii="Montserrat" w:hAnsi="Montserrat"/>
                               <w:b/>
                               <w:bCs/>
                             </w:rPr>
-                            <w:t>Senior-</w:t>
+                            <w:t>{title}</w:t>
                           </w:r>
+                        </w:p>
+                        <w:p>
+                          <w:pPr>
+                            <w:pStyle w:val="NoSpacing"/>
+                            <w:tabs>
+                              <w:tab w:val="left" w:pos="3600"/>
+                              <w:tab w:val="left" w:pos="7200"/>
+                            </w:tabs>
+                            <w:ind w:left="90"/>
+                          </w:pPr>
                           <w:r>
                             <w:rPr>
-                              <w:b/>
-                              <w:bCs/>
+                              <w:rStyle w:val="SubtleReference"/>
+                              <w:rFonts w:ascii="Montserrat" w:hAnsi="Montserrat"/>
+                              <w:smallCaps w:val="0"/>
+                              <w:color w:val="auto"/>
                             </w:rPr>
-                            <w:t>Front-End Engineer</w:t>
+                            <w:t>{email}</w:t>
                           </w:r>
                           <w:r>
                             <w:rPr>
                               <w:rStyle w:val="SubtleReference"/>
-                              <w:rFonts w:ascii="Tw Cen MT" w:hAnsi="Tw Cen MT"/>
-                              <w:b/>
-                              <w:bCs/>
+                              <w:rFonts w:ascii="Montserrat" w:hAnsi="Montserrat"/>
                               <w:smallCaps w:val="0"/>
                               <w:color w:val="auto"/>
                             </w:rPr>
@@ -328,64 +396,14 @@
                           </w:r>
                           <w:r>
                             <w:rPr>
-                              <w:b/>
-                              <w:bCs/>
+                              <w:rFonts w:ascii="Montserrat" w:hAnsi="Montserrat"/>
                             </w:rPr>
-                            <w:t>TypeScript + JavaScript + Vue</w:t>
+                            <w:t>{phone}</w:t>
                           </w:r>
                           <w:r>
                             <w:rPr>
                               <w:rStyle w:val="SubtleReference"/>
-                              <w:rFonts w:ascii="Tw Cen MT" w:hAnsi="Tw Cen MT"/>
-                              <w:b/>
-                              <w:bCs/>
-                              <w:smallCaps w:val="0"/>
-                              <w:color w:val="auto"/>
-                            </w:rPr>
-                            <w:tab/>
-                          </w:r>
-                          <w:r>
-                            <w:rPr>
-                              <w:b/>
-                              <w:bCs/>
-                            </w:rPr>
-                            <w:t>PHP + Laravel</w:t>
-                          </w:r>
-                        </w:p>
-                        <w:p>
-                          <w:pPr>
-                            <w:pStyle w:val="NoSpacing"/>
-                            <w:tabs>
-                              <w:tab w:val="left" w:pos="3600"/>
-                              <w:tab w:val="left" w:pos="7920"/>
-                            </w:tabs>
-                            <w:ind w:left="90"/>
-                          </w:pPr>
-                          <w:r>
-                            <w:rPr>
-                              <w:rStyle w:val="SubtleReference"/>
-                              <w:rFonts w:ascii="Tw Cen MT" w:hAnsi="Tw Cen MT"/>
-                              <w:smallCaps w:val="0"/>
-                              <w:color w:val="auto"/>
-                            </w:rPr>
-                            <w:t>m.jasonvertucio@gmail.com</w:t>
-                          </w:r>
-                          <w:r>
-                            <w:rPr>
-                              <w:rStyle w:val="SubtleReference"/>
-                              <w:rFonts w:ascii="Tw Cen MT" w:hAnsi="Tw Cen MT"/>
-                              <w:smallCaps w:val="0"/>
-                              <w:color w:val="auto"/>
-                            </w:rPr>
-                            <w:tab/>
-                          </w:r>
-                          <w:r>
-                            <w:t>(267) 323-5171</w:t>
-                          </w:r>
-                          <w:r>
-                            <w:rPr>
-                              <w:rStyle w:val="SubtleReference"/>
-                              <w:rFonts w:ascii="Tw Cen MT" w:hAnsi="Tw Cen MT"/>
+                              <w:rFonts w:ascii="Montserrat" w:hAnsi="Montserrat"/>
                               <w:smallCaps w:val="0"/>
                               <w:color w:val="auto"/>
                             </w:rPr>
@@ -395,21 +413,32 @@
                             <w:r>
                               <w:rPr>
                                 <w:rStyle w:val="Hyperlink"/>
+                                <w:rFonts w:ascii="Montserrat" w:hAnsi="Montserrat"/>
                                 <w:color w:val="FFFFFF" w:themeColor="background1"/>
                                 <w:u w:val="none"/>
                               </w:rPr>
-                              <w:t>linkedin.com/in/</w:t>
+                              <w:t>{</w:t>
                             </w:r>
                             <w:proofErr w:type="spellStart"/>
                             <w:r>
                               <w:rPr>
                                 <w:rStyle w:val="Hyperlink"/>
+                                <w:rFonts w:ascii="Montserrat" w:hAnsi="Montserrat"/>
                                 <w:color w:val="FFFFFF" w:themeColor="background1"/>
                                 <w:u w:val="none"/>
                               </w:rPr>
-                              <w:t>jasonvertucio</w:t>
+                              <w:t>url</w:t>
                             </w:r>
                             <w:proofErr w:type="spellEnd"/>
+                            <w:r>
+                              <w:rPr>
+                                <w:rStyle w:val="Hyperlink"/>
+                                <w:rFonts w:ascii="Montserrat" w:hAnsi="Montserrat"/>
+                                <w:color w:val="FFFFFF" w:themeColor="background1"/>
+                                <w:u w:val="none"/>
+                              </w:rPr>
+                              <w:t>}</w:t>
+                            </w:r>
                           </w:hyperlink>
                         </w:p>
                       </w:txbxContent>
@@ -438,24 +467,35 @@
               <v:stroke joinstyle="miter"/>
               <v:path gradientshapeok="t" o:connecttype="rect"/>
             </v:shapetype>
-            <v:shape id="Text Box 1" o:spid="_x0000_s1026" type="#_x0000_t202" style="position:absolute;margin-left:.6pt;margin-top:-1.25pt;width:620.9pt;height:81.35pt;z-index:-251657216;visibility:visible;mso-wrap-style:square;mso-width-percent:0;mso-height-percent:0;mso-wrap-distance-left:9pt;mso-wrap-distance-top:0;mso-wrap-distance-right:9pt;mso-wrap-distance-bottom:0;mso-position-horizontal:absolute;mso-position-horizontal-relative:page;mso-position-vertical:absolute;mso-position-vertical-relative:page;mso-width-percent:0;mso-height-percent:0;mso-width-relative:margin;mso-height-relative:margin;v-text-anchor:top" o:gfxdata="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" o:allowoverlap="f" fillcolor="#1b587c [3206]" stroked="f" strokeweight="1.5pt">
+            <v:shape id="Text Box 1" o:spid="_x0000_s1026" type="#_x0000_t202" style="position:absolute;margin-left:.75pt;margin-top:-1.5pt;width:620.9pt;height:58.5pt;z-index:-251657216;visibility:visible;mso-wrap-style:square;mso-width-percent:0;mso-height-percent:0;mso-wrap-distance-left:9pt;mso-wrap-distance-top:0;mso-wrap-distance-right:9pt;mso-wrap-distance-bottom:0;mso-position-horizontal:absolute;mso-position-horizontal-relative:page;mso-position-vertical:absolute;mso-position-vertical-relative:page;mso-width-percent:0;mso-height-percent:0;mso-width-relative:margin;mso-height-relative:margin;v-text-anchor:top" o:gfxdata="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" o:allowoverlap="f" fillcolor="#1b587c [3206]" stroked="f" strokeweight="1.5pt">
               <v:textbox>
                 <w:txbxContent>
                   <w:p>
                     <w:pPr>
                       <w:pStyle w:val="Title"/>
+                      <w:tabs>
+                        <w:tab w:val="left" w:pos="7200"/>
+                      </w:tabs>
                       <w:ind w:left="90"/>
                       <w:rPr>
+                        <w:rFonts w:ascii="Josefin Sans Bold" w:hAnsi="Josefin Sans Bold"/>
                         <w:b/>
                         <w:bCs/>
+                        <w:caps/>
+                        <w:sz w:val="40"/>
+                        <w:szCs w:val="40"/>
                       </w:rPr>
                     </w:pPr>
                     <w:r>
                       <w:rPr>
+                        <w:rFonts w:ascii="Josefin Sans Bold" w:hAnsi="Josefin Sans Bold"/>
                         <w:b/>
                         <w:bCs/>
+                        <w:caps/>
+                        <w:sz w:val="40"/>
+                        <w:szCs w:val="40"/>
                       </w:rPr>
-                      <w:t>JASON VERTUCIO</w:t>
+                      <w:t>{name}</w:t>
                     </w:r>
                   </w:p>
                   <w:p>
@@ -463,34 +503,47 @@
                       <w:pStyle w:val="NoSpacing"/>
                       <w:tabs>
                         <w:tab w:val="left" w:pos="3600"/>
+                        <w:tab w:val="left" w:pos="7200"/>
                         <w:tab w:val="left" w:pos="7920"/>
                       </w:tabs>
                       <w:ind w:left="90"/>
                       <w:rPr>
+                        <w:rFonts w:ascii="Montserrat" w:hAnsi="Montserrat"/>
                         <w:b/>
                         <w:bCs/>
                       </w:rPr>
                     </w:pPr>
                     <w:r>
                       <w:rPr>
+                        <w:rFonts w:ascii="Montserrat" w:hAnsi="Montserrat"/>
                         <w:b/>
                         <w:bCs/>
                       </w:rPr>
-                      <w:t>Senior-</w:t>
+                      <w:t>{title}</w:t>
                     </w:r>
+                  </w:p>
+                  <w:p>
+                    <w:pPr>
+                      <w:pStyle w:val="NoSpacing"/>
+                      <w:tabs>
+                        <w:tab w:val="left" w:pos="3600"/>
+                        <w:tab w:val="left" w:pos="7200"/>
+                      </w:tabs>
+                      <w:ind w:left="90"/>
+                    </w:pPr>
                     <w:r>
                       <w:rPr>
-                        <w:b/>
-                        <w:bCs/>
+                        <w:rStyle w:val="SubtleReference"/>
+                        <w:rFonts w:ascii="Montserrat" w:hAnsi="Montserrat"/>
+                        <w:smallCaps w:val="0"/>
+                        <w:color w:val="auto"/>
                       </w:rPr>
-                      <w:t>Front-End Engineer</w:t>
+                      <w:t>{email}</w:t>
                     </w:r>
                     <w:r>
                       <w:rPr>
                         <w:rStyle w:val="SubtleReference"/>
-                        <w:rFonts w:ascii="Tw Cen MT" w:hAnsi="Tw Cen MT"/>
-                        <w:b/>
-                        <w:bCs/>
+                        <w:rFonts w:ascii="Montserrat" w:hAnsi="Montserrat"/>
                         <w:smallCaps w:val="0"/>
                         <w:color w:val="auto"/>
                       </w:rPr>
@@ -498,64 +551,14 @@
                     </w:r>
                     <w:r>
                       <w:rPr>
-                        <w:b/>
-                        <w:bCs/>
+                        <w:rFonts w:ascii="Montserrat" w:hAnsi="Montserrat"/>
                       </w:rPr>
-                      <w:t>TypeScript + JavaScript + Vue</w:t>
+                      <w:t>{phone}</w:t>
                     </w:r>
                     <w:r>
                       <w:rPr>
                         <w:rStyle w:val="SubtleReference"/>
-                        <w:rFonts w:ascii="Tw Cen MT" w:hAnsi="Tw Cen MT"/>
-                        <w:b/>
-                        <w:bCs/>
-                        <w:smallCaps w:val="0"/>
-                        <w:color w:val="auto"/>
-                      </w:rPr>
-                      <w:tab/>
-                    </w:r>
-                    <w:r>
-                      <w:rPr>
-                        <w:b/>
-                        <w:bCs/>
-                      </w:rPr>
-                      <w:t>PHP + Laravel</w:t>
-                    </w:r>
-                  </w:p>
-                  <w:p>
-                    <w:pPr>
-                      <w:pStyle w:val="NoSpacing"/>
-                      <w:tabs>
-                        <w:tab w:val="left" w:pos="3600"/>
-                        <w:tab w:val="left" w:pos="7920"/>
-                      </w:tabs>
-                      <w:ind w:left="90"/>
-                    </w:pPr>
-                    <w:r>
-                      <w:rPr>
-                        <w:rStyle w:val="SubtleReference"/>
-                        <w:rFonts w:ascii="Tw Cen MT" w:hAnsi="Tw Cen MT"/>
-                        <w:smallCaps w:val="0"/>
-                        <w:color w:val="auto"/>
-                      </w:rPr>
-                      <w:t>m.jasonvertucio@gmail.com</w:t>
-                    </w:r>
-                    <w:r>
-                      <w:rPr>
-                        <w:rStyle w:val="SubtleReference"/>
-                        <w:rFonts w:ascii="Tw Cen MT" w:hAnsi="Tw Cen MT"/>
-                        <w:smallCaps w:val="0"/>
-                        <w:color w:val="auto"/>
-                      </w:rPr>
-                      <w:tab/>
-                    </w:r>
-                    <w:r>
-                      <w:t>(267) 323-5171</w:t>
-                    </w:r>
-                    <w:r>
-                      <w:rPr>
-                        <w:rStyle w:val="SubtleReference"/>
-                        <w:rFonts w:ascii="Tw Cen MT" w:hAnsi="Tw Cen MT"/>
+                        <w:rFonts w:ascii="Montserrat" w:hAnsi="Montserrat"/>
                         <w:smallCaps w:val="0"/>
                         <w:color w:val="auto"/>
                       </w:rPr>
@@ -565,21 +568,32 @@
                       <w:r>
                         <w:rPr>
                           <w:rStyle w:val="Hyperlink"/>
+                          <w:rFonts w:ascii="Montserrat" w:hAnsi="Montserrat"/>
                           <w:color w:val="FFFFFF" w:themeColor="background1"/>
                           <w:u w:val="none"/>
                         </w:rPr>
-                        <w:t>linkedin.com/in/</w:t>
+                        <w:t>{</w:t>
                       </w:r>
                       <w:proofErr w:type="spellStart"/>
                       <w:r>
                         <w:rPr>
                           <w:rStyle w:val="Hyperlink"/>
+                          <w:rFonts w:ascii="Montserrat" w:hAnsi="Montserrat"/>
                           <w:color w:val="FFFFFF" w:themeColor="background1"/>
                           <w:u w:val="none"/>
                         </w:rPr>
-                        <w:t>jasonvertucio</w:t>
+                        <w:t>url</w:t>
                       </w:r>
                       <w:proofErr w:type="spellEnd"/>
+                      <w:r>
+                        <w:rPr>
+                          <w:rStyle w:val="Hyperlink"/>
+                          <w:rFonts w:ascii="Montserrat" w:hAnsi="Montserrat"/>
+                          <w:color w:val="FFFFFF" w:themeColor="background1"/>
+                          <w:u w:val="none"/>
+                        </w:rPr>
+                        <w:t>}</w:t>
+                      </w:r>
                     </w:hyperlink>
                   </w:p>
                 </w:txbxContent>

</xml_diff>

<commit_message>
chore: update resume templates and remove unused font settings in markdownToOoxml.js
</commit_message>
<xml_diff>
--- a/resources/resume/2026 cover letter template.docx
+++ b/resources/resume/2026 cover letter template.docx
@@ -9,6 +9,363 @@
           <w:szCs w:val="20"/>
         </w:rPr>
       </w:pPr>
+    </w:p>
+    <w:p>
+      <w:pPr>
+        <w:rPr>
+          <w:rFonts w:ascii="Montserrat" w:hAnsi="Montserrat"/>
+          <w:szCs w:val="20"/>
+        </w:rPr>
+      </w:pPr>
+      <w:r>
+        <w:rPr>
+          <w:noProof/>
+        </w:rPr>
+        <mc:AlternateContent>
+          <mc:Choice Requires="wps">
+            <w:drawing>
+              <wp:anchor distT="0" distB="0" distL="114300" distR="114300" simplePos="0" relativeHeight="251659264" behindDoc="1" locked="0" layoutInCell="1" allowOverlap="0" wp14:anchorId="6D51AEC4" wp14:editId="6DC87077">
+                <wp:simplePos x="0" y="0"/>
+                <wp:positionH relativeFrom="page">
+                  <wp:posOffset>0</wp:posOffset>
+                </wp:positionH>
+                <wp:positionV relativeFrom="page">
+                  <wp:posOffset>0</wp:posOffset>
+                </wp:positionV>
+                <wp:extent cx="7882128" cy="740664"/>
+                <wp:effectExtent l="0" t="0" r="5080" b="2540"/>
+                <wp:wrapTight wrapText="bothSides">
+                  <wp:wrapPolygon edited="0">
+                    <wp:start x="0" y="0"/>
+                    <wp:lineTo x="0" y="21118"/>
+                    <wp:lineTo x="21562" y="21118"/>
+                    <wp:lineTo x="21562" y="0"/>
+                    <wp:lineTo x="0" y="0"/>
+                  </wp:wrapPolygon>
+                </wp:wrapTight>
+                <wp:docPr id="1156361867" name="Text Box 1"/>
+                <wp:cNvGraphicFramePr/>
+                <a:graphic xmlns:a="http://schemas.openxmlformats.org/drawingml/2006/main">
+                  <a:graphicData uri="http://schemas.microsoft.com/office/word/2010/wordprocessingShape">
+                    <wps:wsp>
+                      <wps:cNvSpPr txBox="1"/>
+                      <wps:spPr>
+                        <a:xfrm>
+                          <a:off x="0" y="0"/>
+                          <a:ext cx="7882128" cy="740664"/>
+                        </a:xfrm>
+                        <a:prstGeom prst="rect">
+                          <a:avLst/>
+                        </a:prstGeom>
+                        <a:ln>
+                          <a:noFill/>
+                        </a:ln>
+                      </wps:spPr>
+                      <wps:style>
+                        <a:lnRef idx="3">
+                          <a:schemeClr val="lt1"/>
+                        </a:lnRef>
+                        <a:fillRef idx="1">
+                          <a:schemeClr val="accent3"/>
+                        </a:fillRef>
+                        <a:effectRef idx="1">
+                          <a:schemeClr val="accent3"/>
+                        </a:effectRef>
+                        <a:fontRef idx="minor">
+                          <a:schemeClr val="lt1"/>
+                        </a:fontRef>
+                      </wps:style>
+                      <wps:txbx>
+                        <w:txbxContent>
+                          <w:p>
+                            <w:pPr>
+                              <w:pStyle w:val="Title"/>
+                              <w:tabs>
+                                <w:tab w:val="left" w:pos="7200"/>
+                              </w:tabs>
+                              <w:ind w:left="90"/>
+                              <w:rPr>
+                                <w:rFonts w:ascii="Josefin Sans" w:hAnsi="Josefin Sans"/>
+                                <w:b/>
+                                <w:bCs/>
+                                <w:caps/>
+                                <w:sz w:val="40"/>
+                                <w:szCs w:val="40"/>
+                              </w:rPr>
+                            </w:pPr>
+                            <w:r>
+                              <w:rPr>
+                                <w:rFonts w:ascii="Josefin Sans" w:hAnsi="Josefin Sans"/>
+                                <w:b/>
+                                <w:bCs/>
+                                <w:caps/>
+                                <w:sz w:val="40"/>
+                                <w:szCs w:val="40"/>
+                              </w:rPr>
+                              <w:t>{name}</w:t>
+                            </w:r>
+                          </w:p>
+                          <w:p>
+                            <w:pPr>
+                              <w:pStyle w:val="NoSpacing"/>
+                              <w:tabs>
+                                <w:tab w:val="left" w:pos="3600"/>
+                                <w:tab w:val="left" w:pos="7200"/>
+                                <w:tab w:val="left" w:pos="7920"/>
+                              </w:tabs>
+                              <w:ind w:left="90"/>
+                              <w:rPr>
+                                <w:rFonts w:ascii="Montserrat" w:hAnsi="Montserrat"/>
+                                <w:b/>
+                                <w:bCs/>
+                              </w:rPr>
+                            </w:pPr>
+                            <w:r>
+                              <w:rPr>
+                                <w:rFonts w:ascii="Montserrat" w:hAnsi="Montserrat"/>
+                                <w:b/>
+                                <w:bCs/>
+                              </w:rPr>
+                              <w:t>{title}</w:t>
+                            </w:r>
+                          </w:p>
+                          <w:p>
+                            <w:pPr>
+                              <w:pStyle w:val="NoSpacing"/>
+                              <w:tabs>
+                                <w:tab w:val="left" w:pos="3600"/>
+                                <w:tab w:val="left" w:pos="7200"/>
+                              </w:tabs>
+                              <w:ind w:left="90"/>
+                            </w:pPr>
+                            <w:r>
+                              <w:rPr>
+                                <w:rStyle w:val="SubtleReference"/>
+                                <w:rFonts w:ascii="Montserrat" w:hAnsi="Montserrat"/>
+                                <w:smallCaps w:val="0"/>
+                                <w:color w:val="auto"/>
+                              </w:rPr>
+                              <w:t>{email}</w:t>
+                            </w:r>
+                            <w:r>
+                              <w:rPr>
+                                <w:rStyle w:val="SubtleReference"/>
+                                <w:rFonts w:ascii="Montserrat" w:hAnsi="Montserrat"/>
+                                <w:smallCaps w:val="0"/>
+                                <w:color w:val="auto"/>
+                              </w:rPr>
+                              <w:tab/>
+                            </w:r>
+                            <w:r>
+                              <w:rPr>
+                                <w:rFonts w:ascii="Montserrat" w:hAnsi="Montserrat"/>
+                              </w:rPr>
+                              <w:t>{phone}</w:t>
+                            </w:r>
+                            <w:r>
+                              <w:rPr>
+                                <w:rStyle w:val="SubtleReference"/>
+                                <w:rFonts w:ascii="Montserrat" w:hAnsi="Montserrat"/>
+                                <w:smallCaps w:val="0"/>
+                                <w:color w:val="auto"/>
+                              </w:rPr>
+                              <w:tab/>
+                            </w:r>
+                            <w:hyperlink r:id="rId6" w:history="1">
+                              <w:r>
+                                <w:rPr>
+                                  <w:rStyle w:val="Hyperlink"/>
+                                  <w:rFonts w:ascii="Montserrat" w:hAnsi="Montserrat"/>
+                                  <w:color w:val="FFFFFF" w:themeColor="background1"/>
+                                  <w:u w:val="none"/>
+                                </w:rPr>
+                                <w:t>{</w:t>
+                              </w:r>
+                              <w:proofErr w:type="spellStart"/>
+                              <w:r>
+                                <w:rPr>
+                                  <w:rStyle w:val="Hyperlink"/>
+                                  <w:rFonts w:ascii="Montserrat" w:hAnsi="Montserrat"/>
+                                  <w:color w:val="FFFFFF" w:themeColor="background1"/>
+                                  <w:u w:val="none"/>
+                                </w:rPr>
+                                <w:t>url</w:t>
+                              </w:r>
+                              <w:proofErr w:type="spellEnd"/>
+                              <w:r>
+                                <w:rPr>
+                                  <w:rStyle w:val="Hyperlink"/>
+                                  <w:rFonts w:ascii="Montserrat" w:hAnsi="Montserrat"/>
+                                  <w:color w:val="FFFFFF" w:themeColor="background1"/>
+                                  <w:u w:val="none"/>
+                                </w:rPr>
+                                <w:t>}</w:t>
+                              </w:r>
+                            </w:hyperlink>
+                          </w:p>
+                        </w:txbxContent>
+                      </wps:txbx>
+                      <wps:bodyPr rot="0" spcFirstLastPara="0" vertOverflow="overflow" horzOverflow="overflow" vert="horz" wrap="square" lIns="91440" tIns="45720" rIns="91440" bIns="45720" numCol="1" spcCol="0" rtlCol="0" fromWordArt="0" anchor="t" anchorCtr="0" forceAA="0" compatLnSpc="1">
+                        <a:prstTxWarp prst="textNoShape">
+                          <a:avLst/>
+                        </a:prstTxWarp>
+                        <a:noAutofit/>
+                      </wps:bodyPr>
+                    </wps:wsp>
+                  </a:graphicData>
+                </a:graphic>
+                <wp14:sizeRelH relativeFrom="margin">
+                  <wp14:pctWidth>0</wp14:pctWidth>
+                </wp14:sizeRelH>
+                <wp14:sizeRelV relativeFrom="margin">
+                  <wp14:pctHeight>0</wp14:pctHeight>
+                </wp14:sizeRelV>
+              </wp:anchor>
+            </w:drawing>
+          </mc:Choice>
+          <mc:Fallback>
+            <w:pict>
+              <v:shapetype w14:anchorId="6D51AEC4" id="_x0000_t202" coordsize="21600,21600" o:spt="202" path="m,l,21600r21600,l21600,xe">
+                <v:stroke joinstyle="miter"/>
+                <v:path gradientshapeok="t" o:connecttype="rect"/>
+              </v:shapetype>
+              <v:shape id="Text Box 1" o:spid="_x0000_s1026" type="#_x0000_t202" style="position:absolute;margin-left:0;margin-top:0;width:620.65pt;height:58.3pt;z-index:-251657216;visibility:visible;mso-wrap-style:square;mso-width-percent:0;mso-height-percent:0;mso-wrap-distance-left:9pt;mso-wrap-distance-top:0;mso-wrap-distance-right:9pt;mso-wrap-distance-bottom:0;mso-position-horizontal:absolute;mso-position-horizontal-relative:page;mso-position-vertical:absolute;mso-position-vertical-relative:page;mso-width-percent:0;mso-height-percent:0;mso-width-relative:margin;mso-height-relative:margin;v-text-anchor:top" o:gfxdata="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" o:allowoverlap="f" fillcolor="#1b587c [3206]" stroked="f" strokeweight="1.5pt">
+                <v:textbox>
+                  <w:txbxContent>
+                    <w:p>
+                      <w:pPr>
+                        <w:pStyle w:val="Title"/>
+                        <w:tabs>
+                          <w:tab w:val="left" w:pos="7200"/>
+                        </w:tabs>
+                        <w:ind w:left="90"/>
+                        <w:rPr>
+                          <w:rFonts w:ascii="Josefin Sans" w:hAnsi="Josefin Sans"/>
+                          <w:b/>
+                          <w:bCs/>
+                          <w:caps/>
+                          <w:sz w:val="40"/>
+                          <w:szCs w:val="40"/>
+                        </w:rPr>
+                      </w:pPr>
+                      <w:r>
+                        <w:rPr>
+                          <w:rFonts w:ascii="Josefin Sans" w:hAnsi="Josefin Sans"/>
+                          <w:b/>
+                          <w:bCs/>
+                          <w:caps/>
+                          <w:sz w:val="40"/>
+                          <w:szCs w:val="40"/>
+                        </w:rPr>
+                        <w:t>{name}</w:t>
+                      </w:r>
+                    </w:p>
+                    <w:p>
+                      <w:pPr>
+                        <w:pStyle w:val="NoSpacing"/>
+                        <w:tabs>
+                          <w:tab w:val="left" w:pos="3600"/>
+                          <w:tab w:val="left" w:pos="7200"/>
+                          <w:tab w:val="left" w:pos="7920"/>
+                        </w:tabs>
+                        <w:ind w:left="90"/>
+                        <w:rPr>
+                          <w:rFonts w:ascii="Montserrat" w:hAnsi="Montserrat"/>
+                          <w:b/>
+                          <w:bCs/>
+                        </w:rPr>
+                      </w:pPr>
+                      <w:r>
+                        <w:rPr>
+                          <w:rFonts w:ascii="Montserrat" w:hAnsi="Montserrat"/>
+                          <w:b/>
+                          <w:bCs/>
+                        </w:rPr>
+                        <w:t>{title}</w:t>
+                      </w:r>
+                    </w:p>
+                    <w:p>
+                      <w:pPr>
+                        <w:pStyle w:val="NoSpacing"/>
+                        <w:tabs>
+                          <w:tab w:val="left" w:pos="3600"/>
+                          <w:tab w:val="left" w:pos="7200"/>
+                        </w:tabs>
+                        <w:ind w:left="90"/>
+                      </w:pPr>
+                      <w:r>
+                        <w:rPr>
+                          <w:rStyle w:val="SubtleReference"/>
+                          <w:rFonts w:ascii="Montserrat" w:hAnsi="Montserrat"/>
+                          <w:smallCaps w:val="0"/>
+                          <w:color w:val="auto"/>
+                        </w:rPr>
+                        <w:t>{email}</w:t>
+                      </w:r>
+                      <w:r>
+                        <w:rPr>
+                          <w:rStyle w:val="SubtleReference"/>
+                          <w:rFonts w:ascii="Montserrat" w:hAnsi="Montserrat"/>
+                          <w:smallCaps w:val="0"/>
+                          <w:color w:val="auto"/>
+                        </w:rPr>
+                        <w:tab/>
+                      </w:r>
+                      <w:r>
+                        <w:rPr>
+                          <w:rFonts w:ascii="Montserrat" w:hAnsi="Montserrat"/>
+                        </w:rPr>
+                        <w:t>{phone}</w:t>
+                      </w:r>
+                      <w:r>
+                        <w:rPr>
+                          <w:rStyle w:val="SubtleReference"/>
+                          <w:rFonts w:ascii="Montserrat" w:hAnsi="Montserrat"/>
+                          <w:smallCaps w:val="0"/>
+                          <w:color w:val="auto"/>
+                        </w:rPr>
+                        <w:tab/>
+                      </w:r>
+                      <w:hyperlink r:id="rId7" w:history="1">
+                        <w:r>
+                          <w:rPr>
+                            <w:rStyle w:val="Hyperlink"/>
+                            <w:rFonts w:ascii="Montserrat" w:hAnsi="Montserrat"/>
+                            <w:color w:val="FFFFFF" w:themeColor="background1"/>
+                            <w:u w:val="none"/>
+                          </w:rPr>
+                          <w:t>{</w:t>
+                        </w:r>
+                        <w:proofErr w:type="spellStart"/>
+                        <w:r>
+                          <w:rPr>
+                            <w:rStyle w:val="Hyperlink"/>
+                            <w:rFonts w:ascii="Montserrat" w:hAnsi="Montserrat"/>
+                            <w:color w:val="FFFFFF" w:themeColor="background1"/>
+                            <w:u w:val="none"/>
+                          </w:rPr>
+                          <w:t>url</w:t>
+                        </w:r>
+                        <w:proofErr w:type="spellEnd"/>
+                        <w:r>
+                          <w:rPr>
+                            <w:rStyle w:val="Hyperlink"/>
+                            <w:rFonts w:ascii="Montserrat" w:hAnsi="Montserrat"/>
+                            <w:color w:val="FFFFFF" w:themeColor="background1"/>
+                            <w:u w:val="none"/>
+                          </w:rPr>
+                          <w:t>}</w:t>
+                        </w:r>
+                      </w:hyperlink>
+                    </w:p>
+                  </w:txbxContent>
+                </v:textbox>
+                <w10:wrap type="tight" anchorx="page" anchory="page"/>
+              </v:shape>
+            </w:pict>
+          </mc:Fallback>
+        </mc:AlternateContent>
+      </w:r>
       <w:r>
         <w:rPr>
           <w:rFonts w:ascii="Montserrat" w:hAnsi="Montserrat"/>
@@ -127,12 +484,12 @@
                     </pic:cNvPicPr>
                   </pic:nvPicPr>
                   <pic:blipFill>
-                    <a:blip r:embed="rId6" cstate="print">
+                    <a:blip r:embed="rId8" cstate="print">
                       <a:alphaModFix/>
                       <a:extLst>
                         <a:ext uri="{BEBA8EAE-BF5A-486C-A8C5-ECC9F3942E4B}">
                           <a14:imgProps xmlns:a14="http://schemas.microsoft.com/office/drawing/2010/main">
-                            <a14:imgLayer r:embed="rId7">
+                            <a14:imgLayer r:embed="rId9">
                               <a14:imgEffect>
                                 <a14:brightnessContrast bright="-25000" contrast="100000"/>
                               </a14:imgEffect>
@@ -185,7 +542,7 @@
       </w:r>
     </w:p>
     <w:sectPr>
-      <w:headerReference w:type="default" r:id="rId8"/>
+      <w:headerReference w:type="default" r:id="rId10"/>
       <w:pgSz w:w="12240" w:h="15840"/>
       <w:pgMar w:top="1260" w:right="720" w:bottom="720" w:left="720" w:header="90" w:footer="720" w:gutter="0"/>
       <w:cols w:space="720"/>
@@ -255,355 +612,6 @@
         <w:tab w:val="left" w:pos="7920"/>
       </w:tabs>
     </w:pPr>
-    <w:r>
-      <w:rPr>
-        <w:noProof/>
-      </w:rPr>
-      <mc:AlternateContent>
-        <mc:Choice Requires="wps">
-          <w:drawing>
-            <wp:anchor distT="0" distB="0" distL="114300" distR="114300" simplePos="0" relativeHeight="251659264" behindDoc="1" locked="0" layoutInCell="1" allowOverlap="0" wp14:anchorId="09AB09E3" wp14:editId="0CE5FA50">
-              <wp:simplePos x="0" y="0"/>
-              <wp:positionH relativeFrom="page">
-                <wp:posOffset>9525</wp:posOffset>
-              </wp:positionH>
-              <wp:positionV relativeFrom="page">
-                <wp:posOffset>-19049</wp:posOffset>
-              </wp:positionV>
-              <wp:extent cx="7885723" cy="742950"/>
-              <wp:effectExtent l="0" t="0" r="1270" b="0"/>
-              <wp:wrapTight wrapText="bothSides">
-                <wp:wrapPolygon edited="0">
-                  <wp:start x="0" y="0"/>
-                  <wp:lineTo x="0" y="21046"/>
-                  <wp:lineTo x="21551" y="21046"/>
-                  <wp:lineTo x="21551" y="0"/>
-                  <wp:lineTo x="0" y="0"/>
-                </wp:wrapPolygon>
-              </wp:wrapTight>
-              <wp:docPr id="1156361867" name="Text Box 1"/>
-              <wp:cNvGraphicFramePr/>
-              <a:graphic xmlns:a="http://schemas.openxmlformats.org/drawingml/2006/main">
-                <a:graphicData uri="http://schemas.microsoft.com/office/word/2010/wordprocessingShape">
-                  <wps:wsp>
-                    <wps:cNvSpPr txBox="1"/>
-                    <wps:spPr>
-                      <a:xfrm>
-                        <a:off x="0" y="0"/>
-                        <a:ext cx="7885723" cy="742950"/>
-                      </a:xfrm>
-                      <a:prstGeom prst="rect">
-                        <a:avLst/>
-                      </a:prstGeom>
-                      <a:ln>
-                        <a:noFill/>
-                      </a:ln>
-                    </wps:spPr>
-                    <wps:style>
-                      <a:lnRef idx="3">
-                        <a:schemeClr val="lt1"/>
-                      </a:lnRef>
-                      <a:fillRef idx="1">
-                        <a:schemeClr val="accent3"/>
-                      </a:fillRef>
-                      <a:effectRef idx="1">
-                        <a:schemeClr val="accent3"/>
-                      </a:effectRef>
-                      <a:fontRef idx="minor">
-                        <a:schemeClr val="lt1"/>
-                      </a:fontRef>
-                    </wps:style>
-                    <wps:txbx>
-                      <w:txbxContent>
-                        <w:p>
-                          <w:pPr>
-                            <w:pStyle w:val="Title"/>
-                            <w:tabs>
-                              <w:tab w:val="left" w:pos="7200"/>
-                            </w:tabs>
-                            <w:ind w:left="90"/>
-                            <w:rPr>
-                              <w:rFonts w:ascii="Josefin Sans Bold" w:hAnsi="Josefin Sans Bold"/>
-                              <w:b/>
-                              <w:bCs/>
-                              <w:caps/>
-                              <w:sz w:val="40"/>
-                              <w:szCs w:val="40"/>
-                            </w:rPr>
-                          </w:pPr>
-                          <w:r>
-                            <w:rPr>
-                              <w:rFonts w:ascii="Josefin Sans Bold" w:hAnsi="Josefin Sans Bold"/>
-                              <w:b/>
-                              <w:bCs/>
-                              <w:caps/>
-                              <w:sz w:val="40"/>
-                              <w:szCs w:val="40"/>
-                            </w:rPr>
-                            <w:t>{name}</w:t>
-                          </w:r>
-                        </w:p>
-                        <w:p>
-                          <w:pPr>
-                            <w:pStyle w:val="NoSpacing"/>
-                            <w:tabs>
-                              <w:tab w:val="left" w:pos="3600"/>
-                              <w:tab w:val="left" w:pos="7200"/>
-                              <w:tab w:val="left" w:pos="7920"/>
-                            </w:tabs>
-                            <w:ind w:left="90"/>
-                            <w:rPr>
-                              <w:rFonts w:ascii="Montserrat" w:hAnsi="Montserrat"/>
-                              <w:b/>
-                              <w:bCs/>
-                            </w:rPr>
-                          </w:pPr>
-                          <w:r>
-                            <w:rPr>
-                              <w:rFonts w:ascii="Montserrat" w:hAnsi="Montserrat"/>
-                              <w:b/>
-                              <w:bCs/>
-                            </w:rPr>
-                            <w:t>{title}</w:t>
-                          </w:r>
-                        </w:p>
-                        <w:p>
-                          <w:pPr>
-                            <w:pStyle w:val="NoSpacing"/>
-                            <w:tabs>
-                              <w:tab w:val="left" w:pos="3600"/>
-                              <w:tab w:val="left" w:pos="7200"/>
-                            </w:tabs>
-                            <w:ind w:left="90"/>
-                          </w:pPr>
-                          <w:r>
-                            <w:rPr>
-                              <w:rStyle w:val="SubtleReference"/>
-                              <w:rFonts w:ascii="Montserrat" w:hAnsi="Montserrat"/>
-                              <w:smallCaps w:val="0"/>
-                              <w:color w:val="auto"/>
-                            </w:rPr>
-                            <w:t>{email}</w:t>
-                          </w:r>
-                          <w:r>
-                            <w:rPr>
-                              <w:rStyle w:val="SubtleReference"/>
-                              <w:rFonts w:ascii="Montserrat" w:hAnsi="Montserrat"/>
-                              <w:smallCaps w:val="0"/>
-                              <w:color w:val="auto"/>
-                            </w:rPr>
-                            <w:tab/>
-                          </w:r>
-                          <w:r>
-                            <w:rPr>
-                              <w:rFonts w:ascii="Montserrat" w:hAnsi="Montserrat"/>
-                            </w:rPr>
-                            <w:t>{phone}</w:t>
-                          </w:r>
-                          <w:r>
-                            <w:rPr>
-                              <w:rStyle w:val="SubtleReference"/>
-                              <w:rFonts w:ascii="Montserrat" w:hAnsi="Montserrat"/>
-                              <w:smallCaps w:val="0"/>
-                              <w:color w:val="auto"/>
-                            </w:rPr>
-                            <w:tab/>
-                          </w:r>
-                          <w:hyperlink r:id="rId1" w:history="1">
-                            <w:r>
-                              <w:rPr>
-                                <w:rStyle w:val="Hyperlink"/>
-                                <w:rFonts w:ascii="Montserrat" w:hAnsi="Montserrat"/>
-                                <w:color w:val="FFFFFF" w:themeColor="background1"/>
-                                <w:u w:val="none"/>
-                              </w:rPr>
-                              <w:t>{</w:t>
-                            </w:r>
-                            <w:proofErr w:type="spellStart"/>
-                            <w:r>
-                              <w:rPr>
-                                <w:rStyle w:val="Hyperlink"/>
-                                <w:rFonts w:ascii="Montserrat" w:hAnsi="Montserrat"/>
-                                <w:color w:val="FFFFFF" w:themeColor="background1"/>
-                                <w:u w:val="none"/>
-                              </w:rPr>
-                              <w:t>url</w:t>
-                            </w:r>
-                            <w:proofErr w:type="spellEnd"/>
-                            <w:r>
-                              <w:rPr>
-                                <w:rStyle w:val="Hyperlink"/>
-                                <w:rFonts w:ascii="Montserrat" w:hAnsi="Montserrat"/>
-                                <w:color w:val="FFFFFF" w:themeColor="background1"/>
-                                <w:u w:val="none"/>
-                              </w:rPr>
-                              <w:t>}</w:t>
-                            </w:r>
-                          </w:hyperlink>
-                        </w:p>
-                      </w:txbxContent>
-                    </wps:txbx>
-                    <wps:bodyPr rot="0" spcFirstLastPara="0" vertOverflow="overflow" horzOverflow="overflow" vert="horz" wrap="square" lIns="91440" tIns="45720" rIns="91440" bIns="45720" numCol="1" spcCol="0" rtlCol="0" fromWordArt="0" anchor="t" anchorCtr="0" forceAA="0" compatLnSpc="1">
-                      <a:prstTxWarp prst="textNoShape">
-                        <a:avLst/>
-                      </a:prstTxWarp>
-                      <a:noAutofit/>
-                    </wps:bodyPr>
-                  </wps:wsp>
-                </a:graphicData>
-              </a:graphic>
-              <wp14:sizeRelH relativeFrom="margin">
-                <wp14:pctWidth>0</wp14:pctWidth>
-              </wp14:sizeRelH>
-              <wp14:sizeRelV relativeFrom="margin">
-                <wp14:pctHeight>0</wp14:pctHeight>
-              </wp14:sizeRelV>
-            </wp:anchor>
-          </w:drawing>
-        </mc:Choice>
-        <mc:Fallback>
-          <w:pict>
-            <v:shapetype w14:anchorId="09AB09E3" id="_x0000_t202" coordsize="21600,21600" o:spt="202" path="m,l,21600r21600,l21600,xe">
-              <v:stroke joinstyle="miter"/>
-              <v:path gradientshapeok="t" o:connecttype="rect"/>
-            </v:shapetype>
-            <v:shape id="Text Box 1" o:spid="_x0000_s1026" type="#_x0000_t202" style="position:absolute;margin-left:.75pt;margin-top:-1.5pt;width:620.9pt;height:58.5pt;z-index:-251657216;visibility:visible;mso-wrap-style:square;mso-width-percent:0;mso-height-percent:0;mso-wrap-distance-left:9pt;mso-wrap-distance-top:0;mso-wrap-distance-right:9pt;mso-wrap-distance-bottom:0;mso-position-horizontal:absolute;mso-position-horizontal-relative:page;mso-position-vertical:absolute;mso-position-vertical-relative:page;mso-width-percent:0;mso-height-percent:0;mso-width-relative:margin;mso-height-relative:margin;v-text-anchor:top" o:gfxdata="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" o:allowoverlap="f" fillcolor="#1b587c [3206]" stroked="f" strokeweight="1.5pt">
-              <v:textbox>
-                <w:txbxContent>
-                  <w:p>
-                    <w:pPr>
-                      <w:pStyle w:val="Title"/>
-                      <w:tabs>
-                        <w:tab w:val="left" w:pos="7200"/>
-                      </w:tabs>
-                      <w:ind w:left="90"/>
-                      <w:rPr>
-                        <w:rFonts w:ascii="Josefin Sans Bold" w:hAnsi="Josefin Sans Bold"/>
-                        <w:b/>
-                        <w:bCs/>
-                        <w:caps/>
-                        <w:sz w:val="40"/>
-                        <w:szCs w:val="40"/>
-                      </w:rPr>
-                    </w:pPr>
-                    <w:r>
-                      <w:rPr>
-                        <w:rFonts w:ascii="Josefin Sans Bold" w:hAnsi="Josefin Sans Bold"/>
-                        <w:b/>
-                        <w:bCs/>
-                        <w:caps/>
-                        <w:sz w:val="40"/>
-                        <w:szCs w:val="40"/>
-                      </w:rPr>
-                      <w:t>{name}</w:t>
-                    </w:r>
-                  </w:p>
-                  <w:p>
-                    <w:pPr>
-                      <w:pStyle w:val="NoSpacing"/>
-                      <w:tabs>
-                        <w:tab w:val="left" w:pos="3600"/>
-                        <w:tab w:val="left" w:pos="7200"/>
-                        <w:tab w:val="left" w:pos="7920"/>
-                      </w:tabs>
-                      <w:ind w:left="90"/>
-                      <w:rPr>
-                        <w:rFonts w:ascii="Montserrat" w:hAnsi="Montserrat"/>
-                        <w:b/>
-                        <w:bCs/>
-                      </w:rPr>
-                    </w:pPr>
-                    <w:r>
-                      <w:rPr>
-                        <w:rFonts w:ascii="Montserrat" w:hAnsi="Montserrat"/>
-                        <w:b/>
-                        <w:bCs/>
-                      </w:rPr>
-                      <w:t>{title}</w:t>
-                    </w:r>
-                  </w:p>
-                  <w:p>
-                    <w:pPr>
-                      <w:pStyle w:val="NoSpacing"/>
-                      <w:tabs>
-                        <w:tab w:val="left" w:pos="3600"/>
-                        <w:tab w:val="left" w:pos="7200"/>
-                      </w:tabs>
-                      <w:ind w:left="90"/>
-                    </w:pPr>
-                    <w:r>
-                      <w:rPr>
-                        <w:rStyle w:val="SubtleReference"/>
-                        <w:rFonts w:ascii="Montserrat" w:hAnsi="Montserrat"/>
-                        <w:smallCaps w:val="0"/>
-                        <w:color w:val="auto"/>
-                      </w:rPr>
-                      <w:t>{email}</w:t>
-                    </w:r>
-                    <w:r>
-                      <w:rPr>
-                        <w:rStyle w:val="SubtleReference"/>
-                        <w:rFonts w:ascii="Montserrat" w:hAnsi="Montserrat"/>
-                        <w:smallCaps w:val="0"/>
-                        <w:color w:val="auto"/>
-                      </w:rPr>
-                      <w:tab/>
-                    </w:r>
-                    <w:r>
-                      <w:rPr>
-                        <w:rFonts w:ascii="Montserrat" w:hAnsi="Montserrat"/>
-                      </w:rPr>
-                      <w:t>{phone}</w:t>
-                    </w:r>
-                    <w:r>
-                      <w:rPr>
-                        <w:rStyle w:val="SubtleReference"/>
-                        <w:rFonts w:ascii="Montserrat" w:hAnsi="Montserrat"/>
-                        <w:smallCaps w:val="0"/>
-                        <w:color w:val="auto"/>
-                      </w:rPr>
-                      <w:tab/>
-                    </w:r>
-                    <w:hyperlink r:id="rId2" w:history="1">
-                      <w:r>
-                        <w:rPr>
-                          <w:rStyle w:val="Hyperlink"/>
-                          <w:rFonts w:ascii="Montserrat" w:hAnsi="Montserrat"/>
-                          <w:color w:val="FFFFFF" w:themeColor="background1"/>
-                          <w:u w:val="none"/>
-                        </w:rPr>
-                        <w:t>{</w:t>
-                      </w:r>
-                      <w:proofErr w:type="spellStart"/>
-                      <w:r>
-                        <w:rPr>
-                          <w:rStyle w:val="Hyperlink"/>
-                          <w:rFonts w:ascii="Montserrat" w:hAnsi="Montserrat"/>
-                          <w:color w:val="FFFFFF" w:themeColor="background1"/>
-                          <w:u w:val="none"/>
-                        </w:rPr>
-                        <w:t>url</w:t>
-                      </w:r>
-                      <w:proofErr w:type="spellEnd"/>
-                      <w:r>
-                        <w:rPr>
-                          <w:rStyle w:val="Hyperlink"/>
-                          <w:rFonts w:ascii="Montserrat" w:hAnsi="Montserrat"/>
-                          <w:color w:val="FFFFFF" w:themeColor="background1"/>
-                          <w:u w:val="none"/>
-                        </w:rPr>
-                        <w:t>}</w:t>
-                      </w:r>
-                    </w:hyperlink>
-                  </w:p>
-                </w:txbxContent>
-              </v:textbox>
-              <w10:wrap type="tight" anchorx="page" anchory="page"/>
-            </v:shape>
-          </w:pict>
-        </mc:Fallback>
-      </mc:AlternateContent>
-    </w:r>
   </w:p>
 </w:hdr>
 </file>
@@ -1010,7 +1018,7 @@
     <w:qFormat/>
     <w:rsid w:val="007F3F30"/>
     <w:rPr>
-      <w:rFonts w:ascii="Corbel" w:hAnsi="Corbel"/>
+      <w:rFonts w:ascii="Montserrat" w:hAnsi="Montserrat"/>
       <w:sz w:val="20"/>
     </w:rPr>
   </w:style>
@@ -1029,7 +1037,7 @@
       <w:outlineLvl w:val="0"/>
     </w:pPr>
     <w:rPr>
-      <w:rFonts w:ascii="Convection Condensed" w:eastAsiaTheme="majorEastAsia" w:hAnsi="Convection Condensed" w:cstheme="majorBidi"/>
+      <w:rFonts w:ascii="Josefin Sans" w:eastAsiaTheme="majorEastAsia" w:hAnsi="Josefin Sans" w:cstheme="majorBidi"/>
       <w:color w:val="B35E06" w:themeColor="accent1" w:themeShade="BF"/>
       <w:sz w:val="40"/>
       <w:szCs w:val="40"/>
@@ -1244,7 +1252,7 @@
     <w:uiPriority w:val="9"/>
     <w:rsid w:val="00105255"/>
     <w:rPr>
-      <w:rFonts w:ascii="Convection Condensed" w:eastAsiaTheme="majorEastAsia" w:hAnsi="Convection Condensed" w:cstheme="majorBidi"/>
+      <w:rFonts w:ascii="Josefin Sans" w:eastAsiaTheme="majorEastAsia" w:hAnsi="Josefin Sans" w:cstheme="majorBidi"/>
       <w:color w:val="B35E06" w:themeColor="accent1" w:themeShade="BF"/>
       <w:sz w:val="40"/>
       <w:szCs w:val="40"/>
@@ -1369,7 +1377,7 @@
       <w:contextualSpacing/>
     </w:pPr>
     <w:rPr>
-      <w:rFonts w:ascii="Convection Condensed" w:eastAsiaTheme="majorEastAsia" w:hAnsi="Convection Condensed" w:cstheme="majorBidi"/>
+      <w:rFonts w:ascii="Josefin Sans" w:eastAsiaTheme="majorEastAsia" w:hAnsi="Josefin Sans" w:cstheme="majorBidi"/>
       <w:spacing w:val="-10"/>
       <w:kern w:val="28"/>
       <w:sz w:val="56"/>
@@ -1383,7 +1391,7 @@
     <w:uiPriority w:val="10"/>
     <w:rsid w:val="00105255"/>
     <w:rPr>
-      <w:rFonts w:ascii="Convection Condensed" w:eastAsiaTheme="majorEastAsia" w:hAnsi="Convection Condensed" w:cstheme="majorBidi"/>
+      <w:rFonts w:ascii="Josefin Sans" w:eastAsiaTheme="majorEastAsia" w:hAnsi="Josefin Sans" w:cstheme="majorBidi"/>
       <w:spacing w:val="-10"/>
       <w:kern w:val="28"/>
       <w:sz w:val="56"/>
@@ -1417,7 +1425,7 @@
     <w:uiPriority w:val="11"/>
     <w:rsid w:val="00105255"/>
     <w:rPr>
-      <w:rFonts w:ascii="Convection" w:eastAsiaTheme="majorEastAsia" w:hAnsi="Convection" w:cstheme="majorBidi"/>
+      <w:rFonts w:ascii="Josefin Sans" w:eastAsiaTheme="majorEastAsia" w:hAnsi="Josefin Sans" w:cstheme="majorBidi"/>
       <w:color w:val="595959" w:themeColor="text1" w:themeTint="A6"/>
       <w:spacing w:val="15"/>
       <w:kern w:val="28"/>
@@ -1534,7 +1542,7 @@
     <w:qFormat/>
     <w:rsid w:val="00070886"/>
     <w:rPr>
-      <w:rFonts w:ascii="Tw Cen MT Condensed" w:hAnsi="Tw Cen MT Condensed"/>
+      <w:rFonts w:ascii="Josefin Sans" w:hAnsi="Josefin Sans"/>
       <w:smallCaps/>
       <w:color w:val="5A5A5A" w:themeColor="text1" w:themeTint="A5"/>
     </w:rPr>
@@ -1548,7 +1556,7 @@
       <w:spacing w:after="0" w:line="240" w:lineRule="auto"/>
     </w:pPr>
     <w:rPr>
-      <w:rFonts w:ascii="Corbel" w:hAnsi="Corbel"/>
+      <w:rFonts w:ascii="Montserrat" w:hAnsi="Montserrat"/>
       <w:sz w:val="20"/>
     </w:rPr>
   </w:style>
@@ -1585,7 +1593,7 @@
     <w:uiPriority w:val="99"/>
     <w:rsid w:val="00D31498"/>
     <w:rPr>
-      <w:rFonts w:ascii="Tw Cen MT" w:hAnsi="Tw Cen MT"/>
+      <w:rFonts w:ascii="Josefin Sans" w:hAnsi="Josefin Sans"/>
     </w:rPr>
   </w:style>
   <w:style w:type="paragraph" w:styleId="Footer">
@@ -1610,7 +1618,7 @@
     <w:uiPriority w:val="99"/>
     <w:rsid w:val="00D31498"/>
     <w:rPr>
-      <w:rFonts w:ascii="Tw Cen MT" w:hAnsi="Tw Cen MT"/>
+      <w:rFonts w:ascii="Josefin Sans" w:hAnsi="Josefin Sans"/>
     </w:rPr>
   </w:style>
 </w:styles>

</xml_diff>